<commit_message>
BSE-4, comp math - 5 dome
</commit_message>
<xml_diff>
--- a/Computation math/Comp_lab_4/Выч Мат ЛР4 P3215  Линейский А.Е. .docx
+++ b/Computation math/Comp_lab_4/Выч Мат ЛР4 P3215  Линейский А.Е. .docx
@@ -356,11 +356,11 @@
         <w:t>6</w:t>
       </w:r>
     </w:p>
-    <w:bookmarkStart w:id="0" w:name="_Toc227189137" w:displacedByCustomXml="next"/>
-    <w:bookmarkStart w:id="1" w:name="_Toc182062724" w:displacedByCustomXml="next"/>
-    <w:bookmarkStart w:id="2" w:name="_Toc178448935" w:displacedByCustomXml="next"/>
-    <w:bookmarkStart w:id="3" w:name="_Toc178448813" w:displacedByCustomXml="next"/>
-    <w:bookmarkStart w:id="4" w:name="_Toc178447396" w:displacedByCustomXml="next"/>
+    <w:bookmarkStart w:id="0" w:name="_Toc229672641" w:displacedByCustomXml="next"/>
+    <w:bookmarkStart w:id="1" w:name="_Toc178447396" w:displacedByCustomXml="next"/>
+    <w:bookmarkStart w:id="2" w:name="_Toc178448813" w:displacedByCustomXml="next"/>
+    <w:bookmarkStart w:id="3" w:name="_Toc178448935" w:displacedByCustomXml="next"/>
+    <w:bookmarkStart w:id="4" w:name="_Toc182062724" w:displacedByCustomXml="next"/>
     <w:sdt>
       <w:sdtPr>
         <w:rPr>
@@ -415,7 +415,7 @@
               <w14:ligatures w14:val="standardContextual"/>
             </w:rPr>
           </w:pPr>
-          <w:hyperlink w:anchor="_Toc227189137" w:history="1">
+          <w:hyperlink w:anchor="_Toc229672641" w:history="1">
             <w:r>
               <w:rPr>
                 <w:rStyle w:val="aa"/>
@@ -442,7 +442,7 @@
                 <w:noProof/>
                 <w:webHidden/>
               </w:rPr>
-              <w:instrText xml:space="preserve"> PAGEREF _Toc227189137 \h </w:instrText>
+              <w:instrText xml:space="preserve"> PAGEREF _Toc229672641 \h </w:instrText>
             </w:r>
             <w:r>
               <w:rPr>
@@ -486,7 +486,7 @@
               <w14:ligatures w14:val="standardContextual"/>
             </w:rPr>
           </w:pPr>
-          <w:hyperlink w:anchor="_Toc227189138" w:history="1">
+          <w:hyperlink w:anchor="_Toc229672642" w:history="1">
             <w:r>
               <w:rPr>
                 <w:rStyle w:val="aa"/>
@@ -513,7 +513,7 @@
                 <w:noProof/>
                 <w:webHidden/>
               </w:rPr>
-              <w:instrText xml:space="preserve"> PAGEREF _Toc227189138 \h </w:instrText>
+              <w:instrText xml:space="preserve"> PAGEREF _Toc229672642 \h </w:instrText>
             </w:r>
             <w:r>
               <w:rPr>
@@ -557,7 +557,7 @@
               <w14:ligatures w14:val="standardContextual"/>
             </w:rPr>
           </w:pPr>
-          <w:hyperlink w:anchor="_Toc227189139" w:history="1">
+          <w:hyperlink w:anchor="_Toc229672643" w:history="1">
             <w:r>
               <w:rPr>
                 <w:rStyle w:val="aa"/>
@@ -584,7 +584,7 @@
                 <w:noProof/>
                 <w:webHidden/>
               </w:rPr>
-              <w:instrText xml:space="preserve"> PAGEREF _Toc227189139 \h </w:instrText>
+              <w:instrText xml:space="preserve"> PAGEREF _Toc229672643 \h </w:instrText>
             </w:r>
             <w:r>
               <w:rPr>
@@ -628,7 +628,7 @@
               <w14:ligatures w14:val="standardContextual"/>
             </w:rPr>
           </w:pPr>
-          <w:hyperlink w:anchor="_Toc227189140" w:history="1">
+          <w:hyperlink w:anchor="_Toc229672644" w:history="1">
             <w:r>
               <w:rPr>
                 <w:rStyle w:val="aa"/>
@@ -655,7 +655,7 @@
                 <w:noProof/>
                 <w:webHidden/>
               </w:rPr>
-              <w:instrText xml:space="preserve"> PAGEREF _Toc227189140 \h </w:instrText>
+              <w:instrText xml:space="preserve"> PAGEREF _Toc229672644 \h </w:instrText>
             </w:r>
             <w:r>
               <w:rPr>
@@ -699,7 +699,7 @@
               <w14:ligatures w14:val="standardContextual"/>
             </w:rPr>
           </w:pPr>
-          <w:hyperlink w:anchor="_Toc227189141" w:history="1">
+          <w:hyperlink w:anchor="_Toc229672645" w:history="1">
             <w:r>
               <w:rPr>
                 <w:rStyle w:val="aa"/>
@@ -726,7 +726,7 @@
                 <w:noProof/>
                 <w:webHidden/>
               </w:rPr>
-              <w:instrText xml:space="preserve"> PAGEREF _Toc227189141 \h </w:instrText>
+              <w:instrText xml:space="preserve"> PAGEREF _Toc229672645 \h </w:instrText>
             </w:r>
             <w:r>
               <w:rPr>
@@ -770,7 +770,7 @@
               <w14:ligatures w14:val="standardContextual"/>
             </w:rPr>
           </w:pPr>
-          <w:hyperlink w:anchor="_Toc227189142" w:history="1">
+          <w:hyperlink w:anchor="_Toc229672646" w:history="1">
             <w:r>
               <w:rPr>
                 <w:rStyle w:val="aa"/>
@@ -797,7 +797,7 @@
                 <w:noProof/>
                 <w:webHidden/>
               </w:rPr>
-              <w:instrText xml:space="preserve"> PAGEREF _Toc227189142 \h </w:instrText>
+              <w:instrText xml:space="preserve"> PAGEREF _Toc229672646 \h </w:instrText>
             </w:r>
             <w:r>
               <w:rPr>
@@ -841,7 +841,7 @@
               <w14:ligatures w14:val="standardContextual"/>
             </w:rPr>
           </w:pPr>
-          <w:hyperlink w:anchor="_Toc227189143" w:history="1">
+          <w:hyperlink w:anchor="_Toc229672647" w:history="1">
             <w:r>
               <w:rPr>
                 <w:rStyle w:val="aa"/>
@@ -868,7 +868,7 @@
                 <w:noProof/>
                 <w:webHidden/>
               </w:rPr>
-              <w:instrText xml:space="preserve"> PAGEREF _Toc227189143 \h </w:instrText>
+              <w:instrText xml:space="preserve"> PAGEREF _Toc229672647 \h </w:instrText>
             </w:r>
             <w:r>
               <w:rPr>
@@ -912,7 +912,7 @@
               <w14:ligatures w14:val="standardContextual"/>
             </w:rPr>
           </w:pPr>
-          <w:hyperlink w:anchor="_Toc227189144" w:history="1">
+          <w:hyperlink w:anchor="_Toc229672648" w:history="1">
             <w:r>
               <w:rPr>
                 <w:rStyle w:val="aa"/>
@@ -939,7 +939,7 @@
                 <w:noProof/>
                 <w:webHidden/>
               </w:rPr>
-              <w:instrText xml:space="preserve"> PAGEREF _Toc227189144 \h </w:instrText>
+              <w:instrText xml:space="preserve"> PAGEREF _Toc229672648 \h </w:instrText>
             </w:r>
             <w:r>
               <w:rPr>
@@ -982,7 +982,7 @@
               <w14:ligatures w14:val="standardContextual"/>
             </w:rPr>
           </w:pPr>
-          <w:hyperlink w:anchor="_Toc227189145" w:history="1">
+          <w:hyperlink w:anchor="_Toc229672649" w:history="1">
             <w:r>
               <w:rPr>
                 <w:rStyle w:val="aa"/>
@@ -1009,7 +1009,7 @@
                 <w:noProof/>
                 <w:webHidden/>
               </w:rPr>
-              <w:instrText xml:space="preserve"> PAGEREF _Toc227189145 \h </w:instrText>
+              <w:instrText xml:space="preserve"> PAGEREF _Toc229672649 \h </w:instrText>
             </w:r>
             <w:r>
               <w:rPr>
@@ -1053,7 +1053,7 @@
               <w14:ligatures w14:val="standardContextual"/>
             </w:rPr>
           </w:pPr>
-          <w:hyperlink w:anchor="_Toc227189146" w:history="1">
+          <w:hyperlink w:anchor="_Toc229672650" w:history="1">
             <w:r>
               <w:rPr>
                 <w:rStyle w:val="aa"/>
@@ -1080,7 +1080,7 @@
                 <w:noProof/>
                 <w:webHidden/>
               </w:rPr>
-              <w:instrText xml:space="preserve"> PAGEREF _Toc227189146 \h </w:instrText>
+              <w:instrText xml:space="preserve"> PAGEREF _Toc229672650 \h </w:instrText>
             </w:r>
             <w:r>
               <w:rPr>
@@ -1101,386 +1101,6 @@
                 <w:webHidden/>
               </w:rPr>
               <w:t>9</w:t>
-            </w:r>
-            <w:r>
-              <w:rPr>
-                <w:noProof/>
-                <w:webHidden/>
-              </w:rPr>
-              <w:fldChar w:fldCharType="end"/>
-            </w:r>
-          </w:hyperlink>
-        </w:p>
-        <w:p>
-          <w:pPr>
-            <w:pStyle w:val="21"/>
-            <w:rPr>
-              <w:rFonts w:cstheme="minorBidi"/>
-              <w:noProof/>
-              <w:kern w:val="2"/>
-              <w:sz w:val="24"/>
-              <w:szCs w:val="24"/>
-              <w14:ligatures w14:val="standardContextual"/>
-            </w:rPr>
-          </w:pPr>
-          <w:hyperlink w:anchor="_Toc227189147" w:history="1">
-            <w:r>
-              <w:rPr>
-                <w:rStyle w:val="aa"/>
-                <w:noProof/>
-              </w:rPr>
-              <w:t>Решение СЛАУ методом Гаусса с выбором главного элемента</w:t>
-            </w:r>
-            <w:r>
-              <w:rPr>
-                <w:noProof/>
-                <w:webHidden/>
-              </w:rPr>
-              <w:tab/>
-            </w:r>
-            <w:r>
-              <w:rPr>
-                <w:noProof/>
-                <w:webHidden/>
-              </w:rPr>
-              <w:fldChar w:fldCharType="begin"/>
-            </w:r>
-            <w:r>
-              <w:rPr>
-                <w:noProof/>
-                <w:webHidden/>
-              </w:rPr>
-              <w:instrText xml:space="preserve"> PAGEREF _Toc227189147 \h </w:instrText>
-            </w:r>
-            <w:r>
-              <w:rPr>
-                <w:noProof/>
-                <w:webHidden/>
-              </w:rPr>
-            </w:r>
-            <w:r>
-              <w:rPr>
-                <w:noProof/>
-                <w:webHidden/>
-              </w:rPr>
-              <w:fldChar w:fldCharType="separate"/>
-            </w:r>
-            <w:r>
-              <w:rPr>
-                <w:noProof/>
-                <w:webHidden/>
-              </w:rPr>
-              <w:t>9</w:t>
-            </w:r>
-            <w:r>
-              <w:rPr>
-                <w:noProof/>
-                <w:webHidden/>
-              </w:rPr>
-              <w:fldChar w:fldCharType="end"/>
-            </w:r>
-          </w:hyperlink>
-        </w:p>
-        <w:p>
-          <w:pPr>
-            <w:pStyle w:val="21"/>
-            <w:rPr>
-              <w:rFonts w:cstheme="minorBidi"/>
-              <w:noProof/>
-              <w:kern w:val="2"/>
-              <w:sz w:val="24"/>
-              <w:szCs w:val="24"/>
-              <w14:ligatures w14:val="standardContextual"/>
-            </w:rPr>
-          </w:pPr>
-          <w:hyperlink w:anchor="_Toc227189148" w:history="1">
-            <w:r>
-              <w:rPr>
-                <w:rStyle w:val="aa"/>
-                <w:noProof/>
-              </w:rPr>
-              <w:t>Вычисление метрик аппроксимации функции</w:t>
-            </w:r>
-            <w:r>
-              <w:rPr>
-                <w:noProof/>
-                <w:webHidden/>
-              </w:rPr>
-              <w:tab/>
-            </w:r>
-            <w:r>
-              <w:rPr>
-                <w:noProof/>
-                <w:webHidden/>
-              </w:rPr>
-              <w:fldChar w:fldCharType="begin"/>
-            </w:r>
-            <w:r>
-              <w:rPr>
-                <w:noProof/>
-                <w:webHidden/>
-              </w:rPr>
-              <w:instrText xml:space="preserve"> PAGEREF _Toc227189148 \h </w:instrText>
-            </w:r>
-            <w:r>
-              <w:rPr>
-                <w:noProof/>
-                <w:webHidden/>
-              </w:rPr>
-            </w:r>
-            <w:r>
-              <w:rPr>
-                <w:noProof/>
-                <w:webHidden/>
-              </w:rPr>
-              <w:fldChar w:fldCharType="separate"/>
-            </w:r>
-            <w:r>
-              <w:rPr>
-                <w:noProof/>
-                <w:webHidden/>
-              </w:rPr>
-              <w:t>9</w:t>
-            </w:r>
-            <w:r>
-              <w:rPr>
-                <w:noProof/>
-                <w:webHidden/>
-              </w:rPr>
-              <w:fldChar w:fldCharType="end"/>
-            </w:r>
-          </w:hyperlink>
-        </w:p>
-        <w:p>
-          <w:pPr>
-            <w:pStyle w:val="21"/>
-            <w:rPr>
-              <w:rFonts w:cstheme="minorBidi"/>
-              <w:noProof/>
-              <w:kern w:val="2"/>
-              <w:sz w:val="24"/>
-              <w:szCs w:val="24"/>
-              <w14:ligatures w14:val="standardContextual"/>
-            </w:rPr>
-          </w:pPr>
-          <w:hyperlink w:anchor="_Toc227189149" w:history="1">
-            <w:r>
-              <w:rPr>
-                <w:rStyle w:val="aa"/>
-                <w:noProof/>
-              </w:rPr>
-              <w:t>Линейная аппроксимация</w:t>
-            </w:r>
-            <w:r>
-              <w:rPr>
-                <w:noProof/>
-                <w:webHidden/>
-              </w:rPr>
-              <w:tab/>
-            </w:r>
-            <w:r>
-              <w:rPr>
-                <w:noProof/>
-                <w:webHidden/>
-              </w:rPr>
-              <w:fldChar w:fldCharType="begin"/>
-            </w:r>
-            <w:r>
-              <w:rPr>
-                <w:noProof/>
-                <w:webHidden/>
-              </w:rPr>
-              <w:instrText xml:space="preserve"> PAGEREF _Toc227189149 \h </w:instrText>
-            </w:r>
-            <w:r>
-              <w:rPr>
-                <w:noProof/>
-                <w:webHidden/>
-              </w:rPr>
-            </w:r>
-            <w:r>
-              <w:rPr>
-                <w:noProof/>
-                <w:webHidden/>
-              </w:rPr>
-              <w:fldChar w:fldCharType="separate"/>
-            </w:r>
-            <w:r>
-              <w:rPr>
-                <w:noProof/>
-                <w:webHidden/>
-              </w:rPr>
-              <w:t>9</w:t>
-            </w:r>
-            <w:r>
-              <w:rPr>
-                <w:noProof/>
-                <w:webHidden/>
-              </w:rPr>
-              <w:fldChar w:fldCharType="end"/>
-            </w:r>
-          </w:hyperlink>
-        </w:p>
-        <w:p>
-          <w:pPr>
-            <w:pStyle w:val="21"/>
-            <w:rPr>
-              <w:rFonts w:cstheme="minorBidi"/>
-              <w:noProof/>
-              <w:kern w:val="2"/>
-              <w:sz w:val="24"/>
-              <w:szCs w:val="24"/>
-              <w14:ligatures w14:val="standardContextual"/>
-            </w:rPr>
-          </w:pPr>
-          <w:hyperlink w:anchor="_Toc227189150" w:history="1">
-            <w:r>
-              <w:rPr>
-                <w:rStyle w:val="aa"/>
-                <w:noProof/>
-              </w:rPr>
-              <w:t>Полином</w:t>
-            </w:r>
-            <w:r>
-              <w:rPr>
-                <w:rStyle w:val="aa"/>
-                <w:noProof/>
-                <w:lang w:val="en-US"/>
-              </w:rPr>
-              <w:t xml:space="preserve"> 2</w:t>
-            </w:r>
-            <w:r>
-              <w:rPr>
-                <w:rStyle w:val="aa"/>
-                <w:noProof/>
-              </w:rPr>
-              <w:t>, 3</w:t>
-            </w:r>
-            <w:r>
-              <w:rPr>
-                <w:rStyle w:val="aa"/>
-                <w:noProof/>
-                <w:lang w:val="en-US"/>
-              </w:rPr>
-              <w:t xml:space="preserve"> </w:t>
-            </w:r>
-            <w:r>
-              <w:rPr>
-                <w:rStyle w:val="aa"/>
-                <w:noProof/>
-              </w:rPr>
-              <w:t>степени</w:t>
-            </w:r>
-            <w:r>
-              <w:rPr>
-                <w:noProof/>
-                <w:webHidden/>
-              </w:rPr>
-              <w:tab/>
-            </w:r>
-            <w:r>
-              <w:rPr>
-                <w:noProof/>
-                <w:webHidden/>
-              </w:rPr>
-              <w:fldChar w:fldCharType="begin"/>
-            </w:r>
-            <w:r>
-              <w:rPr>
-                <w:noProof/>
-                <w:webHidden/>
-              </w:rPr>
-              <w:instrText xml:space="preserve"> PAGEREF _Toc227189150 \h </w:instrText>
-            </w:r>
-            <w:r>
-              <w:rPr>
-                <w:noProof/>
-                <w:webHidden/>
-              </w:rPr>
-            </w:r>
-            <w:r>
-              <w:rPr>
-                <w:noProof/>
-                <w:webHidden/>
-              </w:rPr>
-              <w:fldChar w:fldCharType="separate"/>
-            </w:r>
-            <w:r>
-              <w:rPr>
-                <w:noProof/>
-                <w:webHidden/>
-              </w:rPr>
-              <w:t>10</w:t>
-            </w:r>
-            <w:r>
-              <w:rPr>
-                <w:noProof/>
-                <w:webHidden/>
-              </w:rPr>
-              <w:fldChar w:fldCharType="end"/>
-            </w:r>
-          </w:hyperlink>
-        </w:p>
-        <w:p>
-          <w:pPr>
-            <w:pStyle w:val="21"/>
-            <w:rPr>
-              <w:rFonts w:cstheme="minorBidi"/>
-              <w:noProof/>
-              <w:kern w:val="2"/>
-              <w:sz w:val="24"/>
-              <w:szCs w:val="24"/>
-              <w14:ligatures w14:val="standardContextual"/>
-            </w:rPr>
-          </w:pPr>
-          <w:hyperlink w:anchor="_Toc227189151" w:history="1">
-            <w:r>
-              <w:rPr>
-                <w:rStyle w:val="aa"/>
-                <w:noProof/>
-              </w:rPr>
-              <w:t>Экспоненциальная, логарифмическая, степенная функции</w:t>
-            </w:r>
-            <w:r>
-              <w:rPr>
-                <w:noProof/>
-                <w:webHidden/>
-              </w:rPr>
-              <w:tab/>
-            </w:r>
-            <w:r>
-              <w:rPr>
-                <w:noProof/>
-                <w:webHidden/>
-              </w:rPr>
-              <w:fldChar w:fldCharType="begin"/>
-            </w:r>
-            <w:r>
-              <w:rPr>
-                <w:noProof/>
-                <w:webHidden/>
-              </w:rPr>
-              <w:instrText xml:space="preserve"> PAGEREF _Toc227189151 \h </w:instrText>
-            </w:r>
-            <w:r>
-              <w:rPr>
-                <w:noProof/>
-                <w:webHidden/>
-              </w:rPr>
-            </w:r>
-            <w:r>
-              <w:rPr>
-                <w:noProof/>
-                <w:webHidden/>
-              </w:rPr>
-              <w:fldChar w:fldCharType="separate"/>
-            </w:r>
-            <w:r>
-              <w:rPr>
-                <w:noProof/>
-                <w:webHidden/>
-              </w:rPr>
-              <w:t>11</w:t>
             </w:r>
             <w:r>
               <w:rPr>
@@ -1504,7 +1124,7 @@
               <w14:ligatures w14:val="standardContextual"/>
             </w:rPr>
           </w:pPr>
-          <w:hyperlink w:anchor="_Toc227189152" w:history="1">
+          <w:hyperlink w:anchor="_Toc229672651" w:history="1">
             <w:r>
               <w:rPr>
                 <w:rStyle w:val="aa"/>
@@ -1531,7 +1151,7 @@
                 <w:noProof/>
                 <w:webHidden/>
               </w:rPr>
-              <w:instrText xml:space="preserve"> PAGEREF _Toc227189152 \h </w:instrText>
+              <w:instrText xml:space="preserve"> PAGEREF _Toc229672651 \h </w:instrText>
             </w:r>
             <w:r>
               <w:rPr>
@@ -1551,7 +1171,7 @@
                 <w:noProof/>
                 <w:webHidden/>
               </w:rPr>
-              <w:t>11</w:t>
+              <w:t>10</w:t>
             </w:r>
             <w:r>
               <w:rPr>
@@ -1575,13 +1195,13 @@
               <w14:ligatures w14:val="standardContextual"/>
             </w:rPr>
           </w:pPr>
-          <w:hyperlink w:anchor="_Toc227189153" w:history="1">
+          <w:hyperlink w:anchor="_Toc229672652" w:history="1">
             <w:r>
               <w:rPr>
                 <w:rStyle w:val="aa"/>
                 <w:noProof/>
               </w:rPr>
-              <w:t>Результат работы</w:t>
+              <w:t>Вывод</w:t>
             </w:r>
             <w:r>
               <w:rPr>
@@ -1602,7 +1222,7 @@
                 <w:noProof/>
                 <w:webHidden/>
               </w:rPr>
-              <w:instrText xml:space="preserve"> PAGEREF _Toc227189153 \h </w:instrText>
+              <w:instrText xml:space="preserve"> PAGEREF _Toc229672652 \h </w:instrText>
             </w:r>
             <w:r>
               <w:rPr>
@@ -1622,78 +1242,7 @@
                 <w:noProof/>
                 <w:webHidden/>
               </w:rPr>
-              <w:t>14</w:t>
-            </w:r>
-            <w:r>
-              <w:rPr>
-                <w:noProof/>
-                <w:webHidden/>
-              </w:rPr>
-              <w:fldChar w:fldCharType="end"/>
-            </w:r>
-          </w:hyperlink>
-        </w:p>
-        <w:p>
-          <w:pPr>
-            <w:pStyle w:val="1"/>
-            <w:rPr>
-              <w:rFonts w:asciiTheme="minorHAnsi" w:eastAsiaTheme="minorEastAsia" w:hAnsiTheme="minorHAnsi"/>
-              <w:noProof/>
-              <w:kern w:val="2"/>
-              <w:sz w:val="24"/>
-              <w:szCs w:val="24"/>
-              <w:lang w:eastAsia="ru-RU"/>
-              <w14:ligatures w14:val="standardContextual"/>
-            </w:rPr>
-          </w:pPr>
-          <w:hyperlink w:anchor="_Toc227189154" w:history="1">
-            <w:r>
-              <w:rPr>
-                <w:rStyle w:val="aa"/>
-                <w:noProof/>
-              </w:rPr>
-              <w:t>Вывод</w:t>
-            </w:r>
-            <w:r>
-              <w:rPr>
-                <w:noProof/>
-                <w:webHidden/>
-              </w:rPr>
-              <w:tab/>
-            </w:r>
-            <w:r>
-              <w:rPr>
-                <w:noProof/>
-                <w:webHidden/>
-              </w:rPr>
-              <w:fldChar w:fldCharType="begin"/>
-            </w:r>
-            <w:r>
-              <w:rPr>
-                <w:noProof/>
-                <w:webHidden/>
-              </w:rPr>
-              <w:instrText xml:space="preserve"> PAGEREF _Toc227189154 \h </w:instrText>
-            </w:r>
-            <w:r>
-              <w:rPr>
-                <w:noProof/>
-                <w:webHidden/>
-              </w:rPr>
-            </w:r>
-            <w:r>
-              <w:rPr>
-                <w:noProof/>
-                <w:webHidden/>
-              </w:rPr>
-              <w:fldChar w:fldCharType="separate"/>
-            </w:r>
-            <w:r>
-              <w:rPr>
-                <w:noProof/>
-                <w:webHidden/>
-              </w:rPr>
-              <w:t>14</w:t>
+              <w:t>13</w:t>
             </w:r>
             <w:r>
               <w:rPr>
@@ -1762,23 +1311,98 @@
     <w:p>
       <w:pPr>
         <w:pStyle w:val="a8"/>
+        <w:rPr>
+          <w:lang w:val="en-US"/>
+        </w:rPr>
       </w:pPr>
     </w:p>
     <w:p>
       <w:pPr>
         <w:pStyle w:val="a8"/>
+        <w:rPr>
+          <w:lang w:val="en-US"/>
+        </w:rPr>
       </w:pPr>
     </w:p>
     <w:p>
       <w:pPr>
         <w:pStyle w:val="a8"/>
+        <w:rPr>
+          <w:lang w:val="en-US"/>
+        </w:rPr>
       </w:pPr>
     </w:p>
     <w:p>
       <w:pPr>
+        <w:pStyle w:val="a8"/>
+        <w:rPr>
+          <w:lang w:val="en-US"/>
+        </w:rPr>
+      </w:pPr>
+    </w:p>
+    <w:p>
+      <w:pPr>
+        <w:pStyle w:val="a8"/>
+        <w:rPr>
+          <w:lang w:val="en-US"/>
+        </w:rPr>
+      </w:pPr>
+    </w:p>
+    <w:p>
+      <w:pPr>
+        <w:pStyle w:val="a8"/>
+        <w:rPr>
+          <w:lang w:val="en-US"/>
+        </w:rPr>
+      </w:pPr>
+    </w:p>
+    <w:p>
+      <w:pPr>
+        <w:pStyle w:val="a8"/>
+        <w:rPr>
+          <w:lang w:val="en-US"/>
+        </w:rPr>
+      </w:pPr>
+    </w:p>
+    <w:p>
+      <w:pPr>
+        <w:pStyle w:val="a8"/>
+        <w:rPr>
+          <w:lang w:val="en-US"/>
+        </w:rPr>
+      </w:pPr>
+    </w:p>
+    <w:p>
+      <w:pPr>
+        <w:pStyle w:val="a8"/>
+        <w:rPr>
+          <w:lang w:val="en-US"/>
+        </w:rPr>
+      </w:pPr>
+    </w:p>
+    <w:p>
+      <w:pPr>
+        <w:pStyle w:val="a8"/>
+        <w:rPr>
+          <w:lang w:val="en-US"/>
+        </w:rPr>
+      </w:pPr>
+    </w:p>
+    <w:p>
+      <w:pPr>
+        <w:pStyle w:val="a8"/>
+      </w:pPr>
+    </w:p>
+    <w:p>
+      <w:pPr>
+        <w:pStyle w:val="a8"/>
+      </w:pPr>
+    </w:p>
+    <w:p>
+      <w:pPr>
         <w:pStyle w:val="10"/>
       </w:pPr>
-      <w:bookmarkStart w:id="5" w:name="_Toc227189138"/>
+      <w:bookmarkStart w:id="5" w:name="_Toc229672642"/>
       <w:r>
         <w:lastRenderedPageBreak/>
         <w:t>Цель</w:t>
@@ -1797,7 +1421,7 @@
       <w:pPr>
         <w:pStyle w:val="10"/>
       </w:pPr>
-      <w:bookmarkStart w:id="6" w:name="_Toc227189139"/>
+      <w:bookmarkStart w:id="6" w:name="_Toc229672643"/>
       <w:r>
         <w:t>Порядок выполнения работы</w:t>
       </w:r>
@@ -2059,7 +1683,7 @@
       <w:pPr>
         <w:pStyle w:val="10"/>
       </w:pPr>
-      <w:bookmarkStart w:id="7" w:name="_Toc227189140"/>
+      <w:bookmarkStart w:id="7" w:name="_Toc229672644"/>
       <w:r>
         <w:t>Функция по заданию</w:t>
       </w:r>
@@ -2762,12 +2386,21 @@
           <w:iCs/>
         </w:rPr>
       </w:pPr>
+      <w:proofErr w:type="spellStart"/>
       <w:r>
         <w:rPr>
           <w:i/>
           <w:iCs/>
         </w:rPr>
-        <w:t>Табл 1. Табулирование функции на интервале.</w:t>
+        <w:t>Табл</w:t>
+      </w:r>
+      <w:proofErr w:type="spellEnd"/>
+      <w:r>
+        <w:rPr>
+          <w:i/>
+          <w:iCs/>
+        </w:rPr>
+        <w:t xml:space="preserve"> 1. Табулирование функции на интервале.</w:t>
       </w:r>
     </w:p>
     <w:p>
@@ -2804,7 +2437,7 @@
       <w:pPr>
         <w:pStyle w:val="10"/>
       </w:pPr>
-      <w:bookmarkStart w:id="8" w:name="_Toc227189141"/>
+      <w:bookmarkStart w:id="8" w:name="_Toc229672645"/>
       <w:r>
         <w:lastRenderedPageBreak/>
         <w:t>Линейное приближение</w:t>
@@ -4381,6 +4014,7 @@
                 <w:lang w:val="en-US"/>
               </w:rPr>
             </w:pPr>
+            <w:proofErr w:type="spellStart"/>
             <w:r>
               <w:rPr>
                 <w:rFonts w:ascii="Cambria Math" w:hAnsi="Cambria Math"/>
@@ -4391,6 +4025,7 @@
               </w:rPr>
               <w:t>E_i</w:t>
             </w:r>
+            <w:proofErr w:type="spellEnd"/>
           </w:p>
         </w:tc>
       </w:tr>
@@ -5992,7 +5627,7 @@
       <w:pPr>
         <w:pStyle w:val="10"/>
       </w:pPr>
-      <w:bookmarkStart w:id="9" w:name="_Toc227189142"/>
+      <w:bookmarkStart w:id="9" w:name="_Toc229672646"/>
       <w:r>
         <w:t>Квадратичное приближение</w:t>
       </w:r>
@@ -8796,6 +8431,7 @@
                 <w:lang w:val="en-US"/>
               </w:rPr>
             </w:pPr>
+            <w:proofErr w:type="spellStart"/>
             <w:r>
               <w:rPr>
                 <w:rFonts w:ascii="Cambria Math" w:hAnsi="Cambria Math"/>
@@ -8806,6 +8442,7 @@
               </w:rPr>
               <w:t>E_i</w:t>
             </w:r>
+            <w:proofErr w:type="spellEnd"/>
           </w:p>
         </w:tc>
       </w:tr>
@@ -10402,7 +10039,7 @@
       <w:pPr>
         <w:pStyle w:val="10"/>
       </w:pPr>
-      <w:bookmarkStart w:id="10" w:name="_Toc227189143"/>
+      <w:bookmarkStart w:id="10" w:name="_Toc229672647"/>
       <w:r>
         <w:t>Анализ приближений</w:t>
       </w:r>
@@ -10601,7 +10238,7 @@
       <w:pPr>
         <w:pStyle w:val="10"/>
       </w:pPr>
-      <w:bookmarkStart w:id="11" w:name="_Toc227189144"/>
+      <w:bookmarkStart w:id="11" w:name="_Toc229672648"/>
       <w:r>
         <w:t>Вычислительная часть</w:t>
       </w:r>
@@ -10611,7 +10248,7 @@
       <w:pPr>
         <w:pStyle w:val="2"/>
       </w:pPr>
-      <w:bookmarkStart w:id="12" w:name="_Toc227189145"/>
+      <w:bookmarkStart w:id="12" w:name="_Toc229672649"/>
       <w:r>
         <w:t>Интерфейс программы</w:t>
       </w:r>
@@ -10662,57 +10299,40 @@
         </w:drawing>
       </w:r>
     </w:p>
-    <w:p/>
     <w:p>
       <w:pPr>
         <w:pStyle w:val="10"/>
       </w:pPr>
-      <w:bookmarkStart w:id="13" w:name="_Toc227189146"/>
+      <w:bookmarkStart w:id="13" w:name="_Toc229672650"/>
       <w:r>
-        <w:t>Блок схемы численных методов</w:t>
+        <w:lastRenderedPageBreak/>
+        <w:t>Блок схемы численных методо</w:t>
       </w:r>
       <w:bookmarkEnd w:id="13"/>
+      <w:r>
+        <w:t>в</w:t>
+      </w:r>
     </w:p>
     <w:p>
       <w:pPr>
-        <w:pStyle w:val="2"/>
-      </w:pPr>
-      <w:bookmarkStart w:id="14" w:name="_Toc227189147"/>
-      <w:r>
-        <w:t>Решение СЛАУ методом Гаусса с выбором главного элемента</w:t>
-      </w:r>
-      <w:bookmarkEnd w:id="14"/>
+        <w:rPr>
+          <w:noProof/>
+        </w:rPr>
+      </w:pPr>
     </w:p>
     <w:p>
       <w:pPr>
-        <w:pStyle w:val="2"/>
-      </w:pPr>
-      <w:bookmarkStart w:id="15" w:name="_Toc227189148"/>
-      <w:r>
-        <w:t>Вычисление метрик аппроксимации функции</w:t>
-      </w:r>
-      <w:bookmarkEnd w:id="15"/>
-    </w:p>
-    <w:p>
-      <w:pPr>
-        <w:pStyle w:val="2"/>
-      </w:pPr>
-      <w:bookmarkStart w:id="16" w:name="_Toc227189149"/>
-      <w:r>
-        <w:t>Линейная аппроксимация</w:t>
-      </w:r>
-      <w:bookmarkEnd w:id="16"/>
-    </w:p>
-    <w:p>
+        <w:jc w:val="center"/>
+      </w:pPr>
       <w:r>
         <w:rPr>
           <w:noProof/>
         </w:rPr>
         <w:drawing>
-          <wp:inline distT="0" distB="0" distL="0" distR="0" wp14:anchorId="178A8797" wp14:editId="4CADAC89">
-            <wp:extent cx="5574708" cy="7155712"/>
-            <wp:effectExtent l="0" t="0" r="0" b="7620"/>
-            <wp:docPr id="5" name="Рисунок 5"/>
+          <wp:inline distT="0" distB="0" distL="0" distR="0" wp14:anchorId="6BB82DB0" wp14:editId="059B9A51">
+            <wp:extent cx="4539960" cy="6447934"/>
+            <wp:effectExtent l="0" t="0" r="0" b="0"/>
+            <wp:docPr id="16" name="Рисунок 16"/>
             <wp:cNvGraphicFramePr>
               <a:graphicFrameLocks xmlns:a="http://schemas.openxmlformats.org/drawingml/2006/main" noChangeAspect="1"/>
             </wp:cNvGraphicFramePr>
@@ -10720,26 +10340,26 @@
               <a:graphicData uri="http://schemas.openxmlformats.org/drawingml/2006/picture">
                 <pic:pic xmlns:pic="http://schemas.openxmlformats.org/drawingml/2006/picture">
                   <pic:nvPicPr>
-                    <pic:cNvPr id="0" name="Picture 1"/>
+                    <pic:cNvPr id="0" name="Picture 9"/>
                     <pic:cNvPicPr>
                       <a:picLocks noChangeAspect="1" noChangeArrowheads="1"/>
                     </pic:cNvPicPr>
                   </pic:nvPicPr>
                   <pic:blipFill rotWithShape="1">
-                    <a:blip r:embed="rId11">
+                    <a:blip r:embed="rId11" cstate="print">
                       <a:extLst>
                         <a:ext uri="{28A0092B-C50C-407E-A947-70E740481C1C}">
                           <a14:useLocalDpi xmlns:a14="http://schemas.microsoft.com/office/drawing/2010/main" val="0"/>
                         </a:ext>
                       </a:extLst>
                     </a:blip>
-                    <a:srcRect r="62230"/>
+                    <a:srcRect r="64501"/>
                     <a:stretch/>
                   </pic:blipFill>
                   <pic:spPr bwMode="auto">
                     <a:xfrm>
                       <a:off x="0" y="0"/>
-                      <a:ext cx="5600021" cy="7188204"/>
+                      <a:ext cx="4556561" cy="6471512"/>
                     </a:xfrm>
                     <a:prstGeom prst="rect">
                       <a:avLst/>
@@ -10763,46 +10383,21 @@
     </w:p>
     <w:p>
       <w:pPr>
-        <w:pStyle w:val="2"/>
+        <w:pStyle w:val="10"/>
         <w:rPr>
           <w:lang w:val="en-US"/>
         </w:rPr>
       </w:pPr>
-      <w:bookmarkStart w:id="17" w:name="_Toc227189150"/>
-      <w:r>
-        <w:lastRenderedPageBreak/>
-        <w:t>Полином</w:t>
-      </w:r>
-      <w:r>
-        <w:rPr>
-          <w:lang w:val="en-US"/>
-        </w:rPr>
-        <w:t xml:space="preserve"> 2</w:t>
-      </w:r>
-      <w:r>
-        <w:t>, 3</w:t>
-      </w:r>
-      <w:r>
-        <w:rPr>
-          <w:lang w:val="en-US"/>
-        </w:rPr>
-        <w:t xml:space="preserve"> </w:t>
-      </w:r>
-      <w:r>
-        <w:t>степени</w:t>
-      </w:r>
-      <w:bookmarkEnd w:id="17"/>
-    </w:p>
-    <w:p>
       <w:r>
         <w:rPr>
           <w:noProof/>
         </w:rPr>
+        <w:lastRenderedPageBreak/>
         <w:drawing>
-          <wp:inline distT="0" distB="0" distL="0" distR="0" wp14:anchorId="2C9F1728" wp14:editId="56542ACE">
-            <wp:extent cx="5071110" cy="7251405"/>
-            <wp:effectExtent l="0" t="0" r="0" b="0"/>
-            <wp:docPr id="7" name="Рисунок 7"/>
+          <wp:inline distT="0" distB="0" distL="0" distR="0" wp14:anchorId="1E50BDB8" wp14:editId="1C0D4524">
+            <wp:extent cx="4090989" cy="5060515"/>
+            <wp:effectExtent l="0" t="0" r="5080" b="0"/>
+            <wp:docPr id="13" name="Рисунок 13"/>
             <wp:cNvGraphicFramePr>
               <a:graphicFrameLocks xmlns:a="http://schemas.openxmlformats.org/drawingml/2006/main" noChangeAspect="1"/>
             </wp:cNvGraphicFramePr>
@@ -10810,26 +10405,26 @@
               <a:graphicData uri="http://schemas.openxmlformats.org/drawingml/2006/picture">
                 <pic:pic xmlns:pic="http://schemas.openxmlformats.org/drawingml/2006/picture">
                   <pic:nvPicPr>
-                    <pic:cNvPr id="0" name="Picture 5"/>
+                    <pic:cNvPr id="0" name="Picture 6"/>
                     <pic:cNvPicPr>
                       <a:picLocks noChangeAspect="1" noChangeArrowheads="1"/>
                     </pic:cNvPicPr>
                   </pic:nvPicPr>
                   <pic:blipFill rotWithShape="1">
-                    <a:blip r:embed="rId12">
+                    <a:blip r:embed="rId12" cstate="print">
                       <a:extLst>
                         <a:ext uri="{28A0092B-C50C-407E-A947-70E740481C1C}">
                           <a14:useLocalDpi xmlns:a14="http://schemas.microsoft.com/office/drawing/2010/main" val="0"/>
                         </a:ext>
                       </a:extLst>
                     </a:blip>
-                    <a:srcRect l="36695" r="35375" b="15841"/>
+                    <a:srcRect l="45942" r="24427" b="27238"/>
                     <a:stretch/>
                   </pic:blipFill>
                   <pic:spPr bwMode="auto">
                     <a:xfrm>
                       <a:off x="0" y="0"/>
-                      <a:ext cx="5084696" cy="7270832"/>
+                      <a:ext cx="4093176" cy="5063221"/>
                     </a:xfrm>
                     <a:prstGeom prst="rect">
                       <a:avLst/>
@@ -10850,29 +10445,11 @@
           </wp:inline>
         </w:drawing>
       </w:r>
-    </w:p>
-    <w:p/>
-    <w:p/>
-    <w:p/>
-    <w:p>
-      <w:pPr>
-        <w:pStyle w:val="2"/>
-      </w:pPr>
+      <w:bookmarkStart w:id="14" w:name="_Toc229672651"/>
     </w:p>
     <w:p>
       <w:pPr>
-        <w:pStyle w:val="2"/>
-      </w:pPr>
-      <w:bookmarkStart w:id="18" w:name="_Toc227189151"/>
-      <w:r>
-        <w:lastRenderedPageBreak/>
-        <w:t>Экспоненциальная, логарифмическая, степенная функции</w:t>
-      </w:r>
-      <w:bookmarkEnd w:id="18"/>
-    </w:p>
-    <w:p>
-      <w:pPr>
-        <w:ind w:firstLine="0"/>
+        <w:pStyle w:val="10"/>
         <w:rPr>
           <w:lang w:val="en-US"/>
         </w:rPr>
@@ -10880,12 +10457,13 @@
       <w:r>
         <w:rPr>
           <w:noProof/>
+          <w:lang w:val="en-US"/>
         </w:rPr>
         <w:drawing>
-          <wp:inline distT="0" distB="0" distL="0" distR="0" wp14:anchorId="557FAD47" wp14:editId="0DAC999A">
-            <wp:extent cx="5974632" cy="3338623"/>
-            <wp:effectExtent l="0" t="0" r="7620" b="0"/>
-            <wp:docPr id="8" name="Рисунок 8"/>
+          <wp:inline distT="0" distB="0" distL="0" distR="0" wp14:anchorId="7FAAED6D" wp14:editId="4101DD95">
+            <wp:extent cx="4097189" cy="2653747"/>
+            <wp:effectExtent l="0" t="0" r="0" b="0"/>
+            <wp:docPr id="14" name="Рисунок 14"/>
             <wp:cNvGraphicFramePr>
               <a:graphicFrameLocks xmlns:a="http://schemas.openxmlformats.org/drawingml/2006/main" noChangeAspect="1"/>
             </wp:cNvGraphicFramePr>
@@ -10899,20 +10477,20 @@
                     </pic:cNvPicPr>
                   </pic:nvPicPr>
                   <pic:blipFill rotWithShape="1">
-                    <a:blip r:embed="rId12">
+                    <a:blip r:embed="rId13">
                       <a:extLst>
                         <a:ext uri="{28A0092B-C50C-407E-A947-70E740481C1C}">
                           <a14:useLocalDpi xmlns:a14="http://schemas.microsoft.com/office/drawing/2010/main" val="0"/>
                         </a:ext>
                       </a:extLst>
                     </a:blip>
-                    <a:srcRect l="64263" b="57919"/>
+                    <a:srcRect l="75064" b="67938"/>
                     <a:stretch/>
                   </pic:blipFill>
                   <pic:spPr bwMode="auto">
                     <a:xfrm>
                       <a:off x="0" y="0"/>
-                      <a:ext cx="6012709" cy="3359900"/>
+                      <a:ext cx="4119719" cy="2668340"/>
                     </a:xfrm>
                     <a:prstGeom prst="rect">
                       <a:avLst/>
@@ -10938,14 +10516,13 @@
       <w:pPr>
         <w:pStyle w:val="10"/>
       </w:pPr>
-      <w:bookmarkStart w:id="19" w:name="_Toc227189152"/>
       <w:r>
         <w:t xml:space="preserve">Исходный </w:t>
       </w:r>
       <w:r>
         <w:t>программы</w:t>
       </w:r>
-      <w:bookmarkEnd w:id="19"/>
+      <w:bookmarkEnd w:id="14"/>
     </w:p>
     <w:tbl>
       <w:tblPr>
@@ -10964,17 +10541,86 @@
           <w:p>
             <w:pPr>
               <w:pStyle w:val="af2"/>
+            </w:pPr>
+          </w:p>
+          <w:p>
+            <w:pPr>
+              <w:pStyle w:val="af2"/>
+            </w:pPr>
+            <w:r>
+              <w:t xml:space="preserve">class </w:t>
+            </w:r>
+            <w:proofErr w:type="spellStart"/>
+            <w:r>
+              <w:t>MathCore</w:t>
+            </w:r>
+            <w:proofErr w:type="spellEnd"/>
+            <w:r>
+              <w:t>:</w:t>
+            </w:r>
+          </w:p>
+          <w:p>
+            <w:pPr>
+              <w:pStyle w:val="af2"/>
+            </w:pPr>
+            <w:r>
+              <w:t>    @staticmethod</w:t>
+            </w:r>
+          </w:p>
+          <w:p>
+            <w:pPr>
+              <w:pStyle w:val="af2"/>
+            </w:pPr>
+            <w:r>
+              <w:lastRenderedPageBreak/>
+              <w:t xml:space="preserve">    def </w:t>
+            </w:r>
+            <w:proofErr w:type="spellStart"/>
+            <w:r>
+              <w:t>solve_slaue_</w:t>
+            </w:r>
+            <w:proofErr w:type="gramStart"/>
+            <w:r>
+              <w:t>gauss</w:t>
+            </w:r>
+            <w:proofErr w:type="spellEnd"/>
+            <w:r>
+              <w:t>(</w:t>
+            </w:r>
+            <w:proofErr w:type="gramEnd"/>
+            <w:r>
+              <w:t>A, B):</w:t>
+            </w:r>
+          </w:p>
+          <w:p>
+            <w:pPr>
+              <w:pStyle w:val="af2"/>
               <w:rPr>
                 <w:lang w:val="ru-RU"/>
               </w:rPr>
             </w:pPr>
+            <w:r>
+              <w:t xml:space="preserve">        </w:t>
+            </w:r>
+            <w:r>
+              <w:rPr>
+                <w:lang w:val="ru-RU"/>
+              </w:rPr>
+              <w:t>"""метод Гаусса с выбором главного элемента"""</w:t>
+            </w:r>
           </w:p>
           <w:p>
             <w:pPr>
               <w:pStyle w:val="af2"/>
             </w:pPr>
             <w:r>
-              <w:t>class MathCore:</w:t>
+              <w:rPr>
+                <w:lang w:val="ru-RU"/>
+              </w:rPr>
+              <w:t xml:space="preserve">        </w:t>
+            </w:r>
+            <w:r>
+              <w:t>try:</w:t>
             </w:r>
           </w:p>
           <w:p>
@@ -10982,6 +10628,536 @@
               <w:pStyle w:val="af2"/>
             </w:pPr>
             <w:r>
+              <w:t xml:space="preserve">            n = </w:t>
+            </w:r>
+            <w:proofErr w:type="spellStart"/>
+            <w:r>
+              <w:t>len</w:t>
+            </w:r>
+            <w:proofErr w:type="spellEnd"/>
+            <w:r>
+              <w:t>(B)</w:t>
+            </w:r>
+          </w:p>
+          <w:p>
+            <w:pPr>
+              <w:pStyle w:val="af2"/>
+            </w:pPr>
+            <w:r>
+              <w:t xml:space="preserve">            matrix = </w:t>
+            </w:r>
+            <w:proofErr w:type="spellStart"/>
+            <w:proofErr w:type="gramStart"/>
+            <w:r>
+              <w:t>np.column</w:t>
+            </w:r>
+            <w:proofErr w:type="gramEnd"/>
+            <w:r>
+              <w:t>_stack</w:t>
+            </w:r>
+            <w:proofErr w:type="spellEnd"/>
+            <w:r>
+              <w:t>((A, B)).</w:t>
+            </w:r>
+            <w:proofErr w:type="spellStart"/>
+            <w:r>
+              <w:t>astype</w:t>
+            </w:r>
+            <w:proofErr w:type="spellEnd"/>
+            <w:r>
+              <w:t>(np.float64)</w:t>
+            </w:r>
+          </w:p>
+          <w:p>
+            <w:pPr>
+              <w:pStyle w:val="af2"/>
+            </w:pPr>
+            <w:r>
+              <w:t xml:space="preserve">            for </w:t>
+            </w:r>
+            <w:proofErr w:type="spellStart"/>
+            <w:r>
+              <w:t>i</w:t>
+            </w:r>
+            <w:proofErr w:type="spellEnd"/>
+            <w:r>
+              <w:t xml:space="preserve"> in range(n):</w:t>
+            </w:r>
+          </w:p>
+          <w:p>
+            <w:pPr>
+              <w:pStyle w:val="af2"/>
+            </w:pPr>
+            <w:r>
+              <w:t xml:space="preserve">                </w:t>
+            </w:r>
+            <w:proofErr w:type="spellStart"/>
+            <w:r>
+              <w:t>max_row</w:t>
+            </w:r>
+            <w:proofErr w:type="spellEnd"/>
+            <w:r>
+              <w:t xml:space="preserve"> = </w:t>
+            </w:r>
+            <w:proofErr w:type="spellStart"/>
+            <w:r>
+              <w:t>i</w:t>
+            </w:r>
+            <w:proofErr w:type="spellEnd"/>
+            <w:r>
+              <w:t xml:space="preserve"> + </w:t>
+            </w:r>
+            <w:proofErr w:type="spellStart"/>
+            <w:proofErr w:type="gramStart"/>
+            <w:r>
+              <w:t>np.argmax</w:t>
+            </w:r>
+            <w:proofErr w:type="spellEnd"/>
+            <w:proofErr w:type="gramEnd"/>
+            <w:r>
+              <w:t>(</w:t>
+            </w:r>
+            <w:proofErr w:type="spellStart"/>
+            <w:r>
+              <w:t>np.abs</w:t>
+            </w:r>
+            <w:proofErr w:type="spellEnd"/>
+            <w:r>
+              <w:t>(matrix[</w:t>
+            </w:r>
+            <w:proofErr w:type="spellStart"/>
+            <w:r>
+              <w:t>i</w:t>
+            </w:r>
+            <w:proofErr w:type="spellEnd"/>
+            <w:r>
+              <w:t xml:space="preserve">:, </w:t>
+            </w:r>
+            <w:proofErr w:type="spellStart"/>
+            <w:r>
+              <w:t>i</w:t>
+            </w:r>
+            <w:proofErr w:type="spellEnd"/>
+            <w:r>
+              <w:t>]))</w:t>
+            </w:r>
+          </w:p>
+          <w:p>
+            <w:pPr>
+              <w:pStyle w:val="af2"/>
+            </w:pPr>
+            <w:r>
+              <w:t xml:space="preserve">                </w:t>
+            </w:r>
+            <w:proofErr w:type="gramStart"/>
+            <w:r>
+              <w:t>matrix[</w:t>
+            </w:r>
+            <w:proofErr w:type="gramEnd"/>
+            <w:r>
+              <w:t>[</w:t>
+            </w:r>
+            <w:proofErr w:type="spellStart"/>
+            <w:r>
+              <w:t>i</w:t>
+            </w:r>
+            <w:proofErr w:type="spellEnd"/>
+            <w:r>
+              <w:t xml:space="preserve">, </w:t>
+            </w:r>
+            <w:proofErr w:type="spellStart"/>
+            <w:r>
+              <w:t>max_row</w:t>
+            </w:r>
+            <w:proofErr w:type="spellEnd"/>
+            <w:r>
+              <w:t>]] = matrix[[</w:t>
+            </w:r>
+            <w:proofErr w:type="spellStart"/>
+            <w:r>
+              <w:t>max_row</w:t>
+            </w:r>
+            <w:proofErr w:type="spellEnd"/>
+            <w:r>
+              <w:t xml:space="preserve">, </w:t>
+            </w:r>
+            <w:proofErr w:type="spellStart"/>
+            <w:r>
+              <w:t>i</w:t>
+            </w:r>
+            <w:proofErr w:type="spellEnd"/>
+            <w:r>
+              <w:t>]]</w:t>
+            </w:r>
+          </w:p>
+          <w:p>
+            <w:pPr>
+              <w:pStyle w:val="af2"/>
+            </w:pPr>
+            <w:r>
+              <w:t xml:space="preserve">                if </w:t>
+            </w:r>
+            <w:proofErr w:type="gramStart"/>
+            <w:r>
+              <w:t>abs(</w:t>
+            </w:r>
+            <w:proofErr w:type="gramEnd"/>
+            <w:r>
+              <w:t>matrix[</w:t>
+            </w:r>
+            <w:proofErr w:type="spellStart"/>
+            <w:r>
+              <w:t>i</w:t>
+            </w:r>
+            <w:proofErr w:type="spellEnd"/>
+            <w:r>
+              <w:t xml:space="preserve">, </w:t>
+            </w:r>
+            <w:proofErr w:type="spellStart"/>
+            <w:r>
+              <w:t>i</w:t>
+            </w:r>
+            <w:proofErr w:type="spellEnd"/>
+            <w:r>
+              <w:t>]) &lt; 1e-18:</w:t>
+            </w:r>
+          </w:p>
+          <w:p>
+            <w:pPr>
+              <w:pStyle w:val="af2"/>
+            </w:pPr>
+            <w:r>
+              <w:t xml:space="preserve">                    </w:t>
+            </w:r>
+            <w:r>
+              <w:t>continue</w:t>
+            </w:r>
+          </w:p>
+          <w:p>
+            <w:pPr>
+              <w:pStyle w:val="af2"/>
+            </w:pPr>
+            <w:r>
+              <w:t xml:space="preserve">                for j in </w:t>
+            </w:r>
+            <w:proofErr w:type="gramStart"/>
+            <w:r>
+              <w:t>range(</w:t>
+            </w:r>
+            <w:proofErr w:type="spellStart"/>
+            <w:proofErr w:type="gramEnd"/>
+            <w:r>
+              <w:t>i</w:t>
+            </w:r>
+            <w:proofErr w:type="spellEnd"/>
+            <w:r>
+              <w:t xml:space="preserve"> + 1, n):</w:t>
+            </w:r>
+          </w:p>
+          <w:p>
+            <w:pPr>
+              <w:pStyle w:val="af2"/>
+            </w:pPr>
+            <w:r>
+              <w:t xml:space="preserve">                    ratio = </w:t>
+            </w:r>
+            <w:proofErr w:type="gramStart"/>
+            <w:r>
+              <w:t>matrix[</w:t>
+            </w:r>
+            <w:proofErr w:type="gramEnd"/>
+            <w:r>
+              <w:t xml:space="preserve">j, </w:t>
+            </w:r>
+            <w:proofErr w:type="spellStart"/>
+            <w:r>
+              <w:t>i</w:t>
+            </w:r>
+            <w:proofErr w:type="spellEnd"/>
+            <w:r>
+              <w:t>] / matrix[</w:t>
+            </w:r>
+            <w:proofErr w:type="spellStart"/>
+            <w:r>
+              <w:t>i</w:t>
+            </w:r>
+            <w:proofErr w:type="spellEnd"/>
+            <w:r>
+              <w:t xml:space="preserve">, </w:t>
+            </w:r>
+            <w:proofErr w:type="spellStart"/>
+            <w:r>
+              <w:t>i</w:t>
+            </w:r>
+            <w:proofErr w:type="spellEnd"/>
+            <w:r>
+              <w:t>]</w:t>
+            </w:r>
+          </w:p>
+          <w:p>
+            <w:pPr>
+              <w:pStyle w:val="af2"/>
+            </w:pPr>
+            <w:r>
+              <w:t xml:space="preserve">                    </w:t>
+            </w:r>
+            <w:proofErr w:type="gramStart"/>
+            <w:r>
+              <w:t>matrix[</w:t>
+            </w:r>
+            <w:proofErr w:type="gramEnd"/>
+            <w:r>
+              <w:t>j, i:] -= ratio * matrix[</w:t>
+            </w:r>
+            <w:proofErr w:type="spellStart"/>
+            <w:r>
+              <w:t>i</w:t>
+            </w:r>
+            <w:proofErr w:type="spellEnd"/>
+            <w:r>
+              <w:t>, i:]</w:t>
+            </w:r>
+          </w:p>
+          <w:p>
+            <w:pPr>
+              <w:pStyle w:val="af2"/>
+            </w:pPr>
+            <w:r>
+              <w:t xml:space="preserve">            x = </w:t>
+            </w:r>
+            <w:proofErr w:type="spellStart"/>
+            <w:proofErr w:type="gramStart"/>
+            <w:r>
+              <w:t>np.zeros</w:t>
+            </w:r>
+            <w:proofErr w:type="spellEnd"/>
+            <w:proofErr w:type="gramEnd"/>
+            <w:r>
+              <w:t>(n)</w:t>
+            </w:r>
+          </w:p>
+          <w:p>
+            <w:pPr>
+              <w:pStyle w:val="af2"/>
+            </w:pPr>
+            <w:r>
+              <w:t xml:space="preserve">            for </w:t>
+            </w:r>
+            <w:proofErr w:type="spellStart"/>
+            <w:r>
+              <w:t>i</w:t>
+            </w:r>
+            <w:proofErr w:type="spellEnd"/>
+            <w:r>
+              <w:t xml:space="preserve"> in </w:t>
+            </w:r>
+            <w:proofErr w:type="gramStart"/>
+            <w:r>
+              <w:t>range(</w:t>
+            </w:r>
+            <w:proofErr w:type="gramEnd"/>
+            <w:r>
+              <w:t>n - 1, -1, -1):</w:t>
+            </w:r>
+          </w:p>
+          <w:p>
+            <w:pPr>
+              <w:pStyle w:val="af2"/>
+            </w:pPr>
+            <w:r>
+              <w:t xml:space="preserve">                if </w:t>
+            </w:r>
+            <w:proofErr w:type="gramStart"/>
+            <w:r>
+              <w:t>abs(</w:t>
+            </w:r>
+            <w:proofErr w:type="gramEnd"/>
+            <w:r>
+              <w:t>matrix[</w:t>
+            </w:r>
+            <w:proofErr w:type="spellStart"/>
+            <w:r>
+              <w:t>i</w:t>
+            </w:r>
+            <w:proofErr w:type="spellEnd"/>
+            <w:r>
+              <w:t xml:space="preserve">, </w:t>
+            </w:r>
+            <w:proofErr w:type="spellStart"/>
+            <w:r>
+              <w:t>i</w:t>
+            </w:r>
+            <w:proofErr w:type="spellEnd"/>
+            <w:r>
+              <w:t>]) &lt; 1e-18:</w:t>
+            </w:r>
+          </w:p>
+          <w:p>
+            <w:pPr>
+              <w:pStyle w:val="af2"/>
+            </w:pPr>
+            <w:r>
+              <w:t>                    x[</w:t>
+            </w:r>
+            <w:proofErr w:type="spellStart"/>
+            <w:r>
+              <w:t>i</w:t>
+            </w:r>
+            <w:proofErr w:type="spellEnd"/>
+            <w:r>
+              <w:t>] = 0</w:t>
+            </w:r>
+          </w:p>
+          <w:p>
+            <w:pPr>
+              <w:pStyle w:val="af2"/>
+            </w:pPr>
+            <w:r>
+              <w:t>                else:</w:t>
+            </w:r>
+          </w:p>
+          <w:p>
+            <w:pPr>
+              <w:pStyle w:val="af2"/>
+            </w:pPr>
+            <w:r>
+              <w:t>                    x[</w:t>
+            </w:r>
+            <w:proofErr w:type="spellStart"/>
+            <w:r>
+              <w:t>i</w:t>
+            </w:r>
+            <w:proofErr w:type="spellEnd"/>
+            <w:r>
+              <w:t>] = (</w:t>
+            </w:r>
+          </w:p>
+          <w:p>
+            <w:pPr>
+              <w:pStyle w:val="af2"/>
+            </w:pPr>
+            <w:r>
+              <w:t xml:space="preserve">                        </w:t>
+            </w:r>
+            <w:proofErr w:type="gramStart"/>
+            <w:r>
+              <w:t>matrix[</w:t>
+            </w:r>
+            <w:proofErr w:type="spellStart"/>
+            <w:proofErr w:type="gramEnd"/>
+            <w:r>
+              <w:t>i</w:t>
+            </w:r>
+            <w:proofErr w:type="spellEnd"/>
+            <w:r>
+              <w:t>, n] - np.dot(matrix[</w:t>
+            </w:r>
+            <w:proofErr w:type="spellStart"/>
+            <w:r>
+              <w:t>i</w:t>
+            </w:r>
+            <w:proofErr w:type="spellEnd"/>
+            <w:r>
+              <w:t xml:space="preserve">, </w:t>
+            </w:r>
+            <w:proofErr w:type="spellStart"/>
+            <w:r>
+              <w:t>i</w:t>
+            </w:r>
+            <w:proofErr w:type="spellEnd"/>
+            <w:r>
+              <w:t xml:space="preserve"> + 1 : n], x[</w:t>
+            </w:r>
+            <w:proofErr w:type="spellStart"/>
+            <w:r>
+              <w:t>i</w:t>
+            </w:r>
+            <w:proofErr w:type="spellEnd"/>
+            <w:r>
+              <w:t xml:space="preserve"> + 1 : n])</w:t>
+            </w:r>
+          </w:p>
+          <w:p>
+            <w:pPr>
+              <w:pStyle w:val="af2"/>
+            </w:pPr>
+            <w:r>
+              <w:t xml:space="preserve">                    ) / </w:t>
+            </w:r>
+            <w:proofErr w:type="gramStart"/>
+            <w:r>
+              <w:t>matrix[</w:t>
+            </w:r>
+            <w:proofErr w:type="spellStart"/>
+            <w:proofErr w:type="gramEnd"/>
+            <w:r>
+              <w:t>i</w:t>
+            </w:r>
+            <w:proofErr w:type="spellEnd"/>
+            <w:r>
+              <w:t xml:space="preserve">, </w:t>
+            </w:r>
+            <w:proofErr w:type="spellStart"/>
+            <w:r>
+              <w:t>i</w:t>
+            </w:r>
+            <w:proofErr w:type="spellEnd"/>
+            <w:r>
+              <w:t>]</w:t>
+            </w:r>
+          </w:p>
+          <w:p>
+            <w:pPr>
+              <w:pStyle w:val="af2"/>
+            </w:pPr>
+            <w:r>
+              <w:t>            return x</w:t>
+            </w:r>
+          </w:p>
+          <w:p>
+            <w:pPr>
+              <w:pStyle w:val="af2"/>
+            </w:pPr>
+            <w:r>
+              <w:t>        except:</w:t>
+            </w:r>
+          </w:p>
+          <w:p>
+            <w:pPr>
+              <w:pStyle w:val="af2"/>
+            </w:pPr>
+            <w:r>
+              <w:t xml:space="preserve">            return </w:t>
+            </w:r>
+            <w:proofErr w:type="spellStart"/>
+            <w:proofErr w:type="gramStart"/>
+            <w:r>
+              <w:t>np.zeros</w:t>
+            </w:r>
+            <w:proofErr w:type="spellEnd"/>
+            <w:proofErr w:type="gramEnd"/>
+            <w:r>
+              <w:t>(</w:t>
+            </w:r>
+            <w:proofErr w:type="spellStart"/>
+            <w:r>
+              <w:t>len</w:t>
+            </w:r>
+            <w:proofErr w:type="spellEnd"/>
+            <w:r>
+              <w:t>(B))</w:t>
+            </w:r>
+          </w:p>
+          <w:p>
+            <w:pPr>
+              <w:pStyle w:val="af2"/>
+            </w:pPr>
+          </w:p>
+          <w:p>
+            <w:pPr>
+              <w:pStyle w:val="af2"/>
+            </w:pPr>
+            <w:r>
               <w:t>    @staticmethod</w:t>
             </w:r>
           </w:p>
@@ -10990,24 +11166,355 @@
               <w:pStyle w:val="af2"/>
             </w:pPr>
             <w:r>
-              <w:t>    def solve_slaue_gauss(A, B):</w:t>
+              <w:t xml:space="preserve">    def </w:t>
+            </w:r>
+            <w:proofErr w:type="spellStart"/>
+            <w:r>
+              <w:t>calculate_</w:t>
+            </w:r>
+            <w:proofErr w:type="gramStart"/>
+            <w:r>
+              <w:t>metrics</w:t>
+            </w:r>
+            <w:proofErr w:type="spellEnd"/>
+            <w:r>
+              <w:t>(</w:t>
+            </w:r>
+            <w:proofErr w:type="gramEnd"/>
+            <w:r>
+              <w:t>x, y, f):</w:t>
             </w:r>
           </w:p>
           <w:p>
             <w:pPr>
               <w:pStyle w:val="af2"/>
+            </w:pPr>
+            <w:r>
+              <w:t xml:space="preserve">        </w:t>
+            </w:r>
+            <w:proofErr w:type="spellStart"/>
+            <w:r>
+              <w:t>y_pred</w:t>
+            </w:r>
+            <w:proofErr w:type="spellEnd"/>
+            <w:r>
+              <w:t xml:space="preserve"> = </w:t>
+            </w:r>
+            <w:proofErr w:type="spellStart"/>
+            <w:proofErr w:type="gramStart"/>
+            <w:r>
+              <w:t>np.array</w:t>
+            </w:r>
+            <w:proofErr w:type="spellEnd"/>
+            <w:proofErr w:type="gramEnd"/>
+            <w:r>
+              <w:t>([f(</w:t>
+            </w:r>
+            <w:proofErr w:type="spellStart"/>
+            <w:r>
+              <w:t>val</w:t>
+            </w:r>
+            <w:proofErr w:type="spellEnd"/>
+            <w:r>
+              <w:t xml:space="preserve">) for </w:t>
+            </w:r>
+            <w:proofErr w:type="spellStart"/>
+            <w:r>
+              <w:t>val</w:t>
+            </w:r>
+            <w:proofErr w:type="spellEnd"/>
+            <w:r>
+              <w:t xml:space="preserve"> in x])</w:t>
+            </w:r>
+          </w:p>
+          <w:p>
+            <w:pPr>
+              <w:pStyle w:val="af2"/>
+            </w:pPr>
+            <w:r>
+              <w:t xml:space="preserve">        eps = y - </w:t>
+            </w:r>
+            <w:proofErr w:type="spellStart"/>
+            <w:r>
+              <w:t>y_pred</w:t>
+            </w:r>
+            <w:proofErr w:type="spellEnd"/>
+          </w:p>
+          <w:p>
+            <w:pPr>
+              <w:pStyle w:val="af2"/>
+            </w:pPr>
+            <w:r>
+              <w:t xml:space="preserve">        s = </w:t>
+            </w:r>
+            <w:proofErr w:type="spellStart"/>
+            <w:r>
+              <w:t>np.sum</w:t>
+            </w:r>
+            <w:proofErr w:type="spellEnd"/>
+            <w:r>
+              <w:t>(eps**2)</w:t>
+            </w:r>
+          </w:p>
+          <w:p>
+            <w:pPr>
+              <w:pStyle w:val="af2"/>
+            </w:pPr>
+            <w:r>
+              <w:t xml:space="preserve">        rms = </w:t>
+            </w:r>
+            <w:proofErr w:type="spellStart"/>
+            <w:proofErr w:type="gramStart"/>
+            <w:r>
+              <w:t>np.sqrt</w:t>
+            </w:r>
+            <w:proofErr w:type="spellEnd"/>
+            <w:proofErr w:type="gramEnd"/>
+            <w:r>
+              <w:t xml:space="preserve">(s / </w:t>
+            </w:r>
+            <w:proofErr w:type="spellStart"/>
+            <w:r>
+              <w:t>len</w:t>
+            </w:r>
+            <w:proofErr w:type="spellEnd"/>
+            <w:r>
+              <w:t>(x))</w:t>
+            </w:r>
+          </w:p>
+          <w:p>
+            <w:pPr>
+              <w:pStyle w:val="af2"/>
+            </w:pPr>
+            <w:r>
+              <w:t xml:space="preserve">        r2 = 1 - (s / </w:t>
+            </w:r>
+            <w:proofErr w:type="spellStart"/>
+            <w:proofErr w:type="gramStart"/>
+            <w:r>
+              <w:t>np.sum</w:t>
+            </w:r>
+            <w:proofErr w:type="spellEnd"/>
+            <w:r>
+              <w:t>(</w:t>
+            </w:r>
+            <w:proofErr w:type="gramEnd"/>
+            <w:r>
+              <w:t xml:space="preserve">(y - </w:t>
+            </w:r>
+            <w:proofErr w:type="spellStart"/>
+            <w:r>
+              <w:t>np.mean</w:t>
+            </w:r>
+            <w:proofErr w:type="spellEnd"/>
+            <w:r>
+              <w:t xml:space="preserve">(y)) ** 2)) # </w:t>
+            </w:r>
+            <w:r>
               <w:rPr>
                 <w:lang w:val="ru-RU"/>
               </w:rPr>
+              <w:t>Коэффициент</w:t>
+            </w:r>
+            <w:r>
+              <w:t xml:space="preserve"> </w:t>
+            </w:r>
+            <w:r>
+              <w:rPr>
+                <w:lang w:val="ru-RU"/>
+              </w:rPr>
+              <w:t>детерминации</w:t>
+            </w:r>
+          </w:p>
+          <w:p>
+            <w:pPr>
+              <w:pStyle w:val="af2"/>
+            </w:pPr>
+            <w:r>
+              <w:t>        return {</w:t>
+            </w:r>
+          </w:p>
+          <w:p>
+            <w:pPr>
+              <w:pStyle w:val="af2"/>
+            </w:pPr>
+            <w:r>
+              <w:t>            "S": float(s),</w:t>
+            </w:r>
+          </w:p>
+          <w:p>
+            <w:pPr>
+              <w:pStyle w:val="af2"/>
+            </w:pPr>
+            <w:r>
+              <w:t>            "RMS": float(rms),</w:t>
+            </w:r>
+          </w:p>
+          <w:p>
+            <w:pPr>
+              <w:pStyle w:val="af2"/>
+            </w:pPr>
+            <w:r>
+              <w:t>            "R2": float(r2),</w:t>
+            </w:r>
+          </w:p>
+          <w:p>
+            <w:pPr>
+              <w:pStyle w:val="af2"/>
+            </w:pPr>
+            <w:r>
+              <w:t>            "</w:t>
+            </w:r>
+            <w:proofErr w:type="spellStart"/>
+            <w:r>
+              <w:t>y_pred</w:t>
+            </w:r>
+            <w:proofErr w:type="spellEnd"/>
+            <w:r>
+              <w:t xml:space="preserve">": </w:t>
+            </w:r>
+            <w:proofErr w:type="spellStart"/>
+            <w:r>
+              <w:t>y_</w:t>
+            </w:r>
+            <w:proofErr w:type="gramStart"/>
+            <w:r>
+              <w:t>pred.tolist</w:t>
+            </w:r>
+            <w:proofErr w:type="spellEnd"/>
+            <w:proofErr w:type="gramEnd"/>
+            <w:r>
+              <w:t>(),</w:t>
+            </w:r>
+          </w:p>
+          <w:p>
+            <w:pPr>
+              <w:pStyle w:val="af2"/>
+            </w:pPr>
+            <w:r>
+              <w:t>        }</w:t>
+            </w:r>
+          </w:p>
+          <w:p>
+            <w:pPr>
+              <w:pStyle w:val="af2"/>
+            </w:pPr>
+          </w:p>
+          <w:p>
+            <w:pPr>
+              <w:pStyle w:val="af2"/>
+            </w:pPr>
+            <w:r>
+              <w:t>    @staticmethod</w:t>
+            </w:r>
+          </w:p>
+          <w:p>
+            <w:pPr>
+              <w:pStyle w:val="af2"/>
+            </w:pPr>
+            <w:r>
+              <w:t xml:space="preserve">    def </w:t>
+            </w:r>
+            <w:proofErr w:type="spellStart"/>
+            <w:r>
+              <w:t>linear_</w:t>
+            </w:r>
+            <w:proofErr w:type="gramStart"/>
+            <w:r>
+              <w:t>approx</w:t>
+            </w:r>
+            <w:proofErr w:type="spellEnd"/>
+            <w:r>
+              <w:t>(</w:t>
+            </w:r>
+            <w:proofErr w:type="gramEnd"/>
+            <w:r>
+              <w:t>x, y):</w:t>
+            </w:r>
+          </w:p>
+          <w:p>
+            <w:pPr>
+              <w:pStyle w:val="af2"/>
+            </w:pPr>
+            <w:r>
+              <w:t xml:space="preserve">        n = </w:t>
+            </w:r>
+            <w:proofErr w:type="spellStart"/>
+            <w:r>
+              <w:t>len</w:t>
+            </w:r>
+            <w:proofErr w:type="spellEnd"/>
+            <w:r>
+              <w:t>(x)</w:t>
+            </w:r>
+          </w:p>
+          <w:p>
+            <w:pPr>
+              <w:pStyle w:val="af2"/>
             </w:pPr>
             <w:r>
               <w:t xml:space="preserve">        </w:t>
             </w:r>
-            <w:r>
-              <w:rPr>
-                <w:lang w:val="ru-RU"/>
-              </w:rPr>
-              <w:t>"""метод Гаусса с выбором главного элемента"""</w:t>
+            <w:proofErr w:type="spellStart"/>
+            <w:r>
+              <w:t>sx</w:t>
+            </w:r>
+            <w:proofErr w:type="spellEnd"/>
+            <w:r>
+              <w:t xml:space="preserve">, </w:t>
+            </w:r>
+            <w:proofErr w:type="spellStart"/>
+            <w:r>
+              <w:t>sy</w:t>
+            </w:r>
+            <w:proofErr w:type="spellEnd"/>
+            <w:r>
+              <w:t xml:space="preserve">, sx2, </w:t>
+            </w:r>
+            <w:proofErr w:type="spellStart"/>
+            <w:r>
+              <w:t>sxy</w:t>
+            </w:r>
+            <w:proofErr w:type="spellEnd"/>
+            <w:r>
+              <w:t xml:space="preserve"> = </w:t>
+            </w:r>
+            <w:proofErr w:type="spellStart"/>
+            <w:r>
+              <w:t>np.sum</w:t>
+            </w:r>
+            <w:proofErr w:type="spellEnd"/>
+            <w:r>
+              <w:t xml:space="preserve">(x), </w:t>
+            </w:r>
+            <w:proofErr w:type="spellStart"/>
+            <w:r>
+              <w:t>np.sum</w:t>
+            </w:r>
+            <w:proofErr w:type="spellEnd"/>
+            <w:r>
+              <w:t xml:space="preserve">(y), </w:t>
+            </w:r>
+            <w:proofErr w:type="spellStart"/>
+            <w:r>
+              <w:t>np.sum</w:t>
+            </w:r>
+            <w:proofErr w:type="spellEnd"/>
+            <w:r>
+              <w:t xml:space="preserve">(x**2), </w:t>
+            </w:r>
+            <w:proofErr w:type="spellStart"/>
+            <w:proofErr w:type="gramStart"/>
+            <w:r>
+              <w:t>np.sum</w:t>
+            </w:r>
+            <w:proofErr w:type="spellEnd"/>
+            <w:r>
+              <w:t>(</w:t>
+            </w:r>
+            <w:proofErr w:type="gramEnd"/>
+            <w:r>
+              <w:t>x * y)</w:t>
             </w:r>
           </w:p>
           <w:p>
@@ -11015,13 +11522,79 @@
               <w:pStyle w:val="af2"/>
             </w:pPr>
             <w:r>
-              <w:rPr>
-                <w:lang w:val="ru-RU"/>
-              </w:rPr>
+              <w:t xml:space="preserve">        A = [[sx2, </w:t>
+            </w:r>
+            <w:proofErr w:type="spellStart"/>
+            <w:r>
+              <w:t>sx</w:t>
+            </w:r>
+            <w:proofErr w:type="spellEnd"/>
+            <w:r>
+              <w:t>], [</w:t>
+            </w:r>
+            <w:proofErr w:type="spellStart"/>
+            <w:r>
+              <w:t>sx</w:t>
+            </w:r>
+            <w:proofErr w:type="spellEnd"/>
+            <w:r>
+              <w:t>, n]]</w:t>
+            </w:r>
+          </w:p>
+          <w:p>
+            <w:pPr>
+              <w:pStyle w:val="af2"/>
+            </w:pPr>
+            <w:r>
+              <w:t>        B = [</w:t>
+            </w:r>
+            <w:proofErr w:type="spellStart"/>
+            <w:r>
+              <w:t>sxy</w:t>
+            </w:r>
+            <w:proofErr w:type="spellEnd"/>
+            <w:r>
+              <w:t xml:space="preserve">, </w:t>
+            </w:r>
+            <w:proofErr w:type="spellStart"/>
+            <w:r>
+              <w:t>sy</w:t>
+            </w:r>
+            <w:proofErr w:type="spellEnd"/>
+            <w:r>
+              <w:t>]</w:t>
+            </w:r>
+          </w:p>
+          <w:p>
+            <w:pPr>
+              <w:pStyle w:val="af2"/>
+            </w:pPr>
+            <w:r>
               <w:t xml:space="preserve">        </w:t>
             </w:r>
-            <w:r>
-              <w:t>try:</w:t>
+            <w:proofErr w:type="spellStart"/>
+            <w:r>
+              <w:t>coeffs</w:t>
+            </w:r>
+            <w:proofErr w:type="spellEnd"/>
+            <w:r>
+              <w:t xml:space="preserve"> = </w:t>
+            </w:r>
+            <w:proofErr w:type="spellStart"/>
+            <w:r>
+              <w:t>MathCore.solve_slaue_</w:t>
+            </w:r>
+            <w:proofErr w:type="gramStart"/>
+            <w:r>
+              <w:t>gauss</w:t>
+            </w:r>
+            <w:proofErr w:type="spellEnd"/>
+            <w:r>
+              <w:t>(</w:t>
+            </w:r>
+            <w:proofErr w:type="gramEnd"/>
+            <w:r>
+              <w:t>A, B)  # [a, b]</w:t>
             </w:r>
           </w:p>
           <w:p>
@@ -11029,23 +11602,75 @@
               <w:pStyle w:val="af2"/>
             </w:pPr>
             <w:r>
-              <w:t>            n = len(B)</w:t>
+              <w:t xml:space="preserve">        a, b = </w:t>
+            </w:r>
+            <w:proofErr w:type="spellStart"/>
+            <w:proofErr w:type="gramStart"/>
+            <w:r>
+              <w:t>coeffs</w:t>
+            </w:r>
+            <w:proofErr w:type="spellEnd"/>
+            <w:r>
+              <w:t>[</w:t>
+            </w:r>
+            <w:proofErr w:type="gramEnd"/>
+            <w:r>
+              <w:t xml:space="preserve">0], </w:t>
+            </w:r>
+            <w:proofErr w:type="spellStart"/>
+            <w:r>
+              <w:t>coeffs</w:t>
+            </w:r>
+            <w:proofErr w:type="spellEnd"/>
+            <w:r>
+              <w:t>[1]</w:t>
             </w:r>
           </w:p>
           <w:p>
             <w:pPr>
               <w:pStyle w:val="af2"/>
             </w:pPr>
-            <w:r>
-              <w:t>            matrix = np.column_stack((A, B)).astype(np.float64)</w:t>
-            </w:r>
           </w:p>
           <w:p>
             <w:pPr>
               <w:pStyle w:val="af2"/>
             </w:pPr>
             <w:r>
-              <w:t>            for i in range(n):</w:t>
+              <w:t xml:space="preserve">        </w:t>
+            </w:r>
+            <w:proofErr w:type="spellStart"/>
+            <w:r>
+              <w:t>xm</w:t>
+            </w:r>
+            <w:proofErr w:type="spellEnd"/>
+            <w:r>
+              <w:t xml:space="preserve">, </w:t>
+            </w:r>
+            <w:proofErr w:type="spellStart"/>
+            <w:r>
+              <w:t>ym</w:t>
+            </w:r>
+            <w:proofErr w:type="spellEnd"/>
+            <w:r>
+              <w:t xml:space="preserve"> = </w:t>
+            </w:r>
+            <w:proofErr w:type="spellStart"/>
+            <w:proofErr w:type="gramStart"/>
+            <w:r>
+              <w:t>np.mean</w:t>
+            </w:r>
+            <w:proofErr w:type="spellEnd"/>
+            <w:proofErr w:type="gramEnd"/>
+            <w:r>
+              <w:t xml:space="preserve">(x), </w:t>
+            </w:r>
+            <w:proofErr w:type="spellStart"/>
+            <w:r>
+              <w:t>np.mean</w:t>
+            </w:r>
+            <w:proofErr w:type="spellEnd"/>
+            <w:r>
+              <w:t>(y)</w:t>
             </w:r>
           </w:p>
           <w:p>
@@ -11053,7 +11678,36 @@
               <w:pStyle w:val="af2"/>
             </w:pPr>
             <w:r>
-              <w:t>                max_row = i + np.argmax(np.abs(matrix[i:, i]))</w:t>
+              <w:t xml:space="preserve">        p = </w:t>
+            </w:r>
+            <w:proofErr w:type="spellStart"/>
+            <w:proofErr w:type="gramStart"/>
+            <w:r>
+              <w:t>np.sum</w:t>
+            </w:r>
+            <w:proofErr w:type="spellEnd"/>
+            <w:r>
+              <w:t>(</w:t>
+            </w:r>
+            <w:proofErr w:type="gramEnd"/>
+            <w:r>
+              <w:t xml:space="preserve">(x - </w:t>
+            </w:r>
+            <w:proofErr w:type="spellStart"/>
+            <w:r>
+              <w:t>xm</w:t>
+            </w:r>
+            <w:proofErr w:type="spellEnd"/>
+            <w:r>
+              <w:t xml:space="preserve">) * (y - </w:t>
+            </w:r>
+            <w:proofErr w:type="spellStart"/>
+            <w:r>
+              <w:t>ym</w:t>
+            </w:r>
+            <w:proofErr w:type="spellEnd"/>
+            <w:r>
+              <w:t>)) / (</w:t>
             </w:r>
           </w:p>
           <w:p>
@@ -11061,7 +11715,49 @@
               <w:pStyle w:val="af2"/>
             </w:pPr>
             <w:r>
-              <w:t>                matrix[[i, max_row]] = matrix[[max_row, i]]</w:t>
+              <w:t xml:space="preserve">            </w:t>
+            </w:r>
+            <w:proofErr w:type="spellStart"/>
+            <w:proofErr w:type="gramStart"/>
+            <w:r>
+              <w:t>np.sqrt</w:t>
+            </w:r>
+            <w:proofErr w:type="spellEnd"/>
+            <w:proofErr w:type="gramEnd"/>
+            <w:r>
+              <w:t>(</w:t>
+            </w:r>
+            <w:proofErr w:type="spellStart"/>
+            <w:r>
+              <w:t>np.sum</w:t>
+            </w:r>
+            <w:proofErr w:type="spellEnd"/>
+            <w:r>
+              <w:t xml:space="preserve">((x - </w:t>
+            </w:r>
+            <w:proofErr w:type="spellStart"/>
+            <w:r>
+              <w:t>xm</w:t>
+            </w:r>
+            <w:proofErr w:type="spellEnd"/>
+            <w:r>
+              <w:t xml:space="preserve">) ** 2) * </w:t>
+            </w:r>
+            <w:proofErr w:type="spellStart"/>
+            <w:r>
+              <w:t>np.sum</w:t>
+            </w:r>
+            <w:proofErr w:type="spellEnd"/>
+            <w:r>
+              <w:t xml:space="preserve">((y - </w:t>
+            </w:r>
+            <w:proofErr w:type="spellStart"/>
+            <w:r>
+              <w:t>ym</w:t>
+            </w:r>
+            <w:proofErr w:type="spellEnd"/>
+            <w:r>
+              <w:t>) ** 2)) or 1</w:t>
             </w:r>
           </w:p>
           <w:p>
@@ -11069,7 +11765,7 @@
               <w:pStyle w:val="af2"/>
             </w:pPr>
             <w:r>
-              <w:t>                if abs(matrix[i, i]) &lt; 1e-18:</w:t>
+              <w:t>        )</w:t>
             </w:r>
           </w:p>
           <w:p>
@@ -11077,10 +11773,7 @@
               <w:pStyle w:val="af2"/>
             </w:pPr>
             <w:r>
-              <w:t xml:space="preserve">                    </w:t>
-            </w:r>
-            <w:r>
-              <w:t>continue</w:t>
+              <w:t>        return (</w:t>
             </w:r>
           </w:p>
           <w:p>
@@ -11088,7 +11781,8 @@
               <w:pStyle w:val="af2"/>
             </w:pPr>
             <w:r>
-              <w:t>                for j in range(i + 1, n):</w:t>
+              <w:lastRenderedPageBreak/>
+              <w:t>            (lambda t: a * t + b),</w:t>
             </w:r>
           </w:p>
           <w:p>
@@ -11096,7 +11790,15 @@
               <w:pStyle w:val="af2"/>
             </w:pPr>
             <w:r>
-              <w:t>                    ratio = matrix[j, i] / matrix[i, i]</w:t>
+              <w:t xml:space="preserve">            </w:t>
+            </w:r>
+            <w:proofErr w:type="spellStart"/>
+            <w:r>
+              <w:t>f"y</w:t>
+            </w:r>
+            <w:proofErr w:type="spellEnd"/>
+            <w:r>
+              <w:t xml:space="preserve"> = {a:.4f}x + {b:.4f}",</w:t>
             </w:r>
           </w:p>
           <w:p>
@@ -11104,7 +11806,7 @@
               <w:pStyle w:val="af2"/>
             </w:pPr>
             <w:r>
-              <w:t>                    matrix[j, i:] -= ratio * matrix[i, i:]</w:t>
+              <w:t>            {"a": a, "b": b, "P": p},</w:t>
             </w:r>
           </w:p>
           <w:p>
@@ -11112,23 +11814,20 @@
               <w:pStyle w:val="af2"/>
             </w:pPr>
             <w:r>
-              <w:t>            x = np.zeros(n)</w:t>
+              <w:t>        )</w:t>
             </w:r>
           </w:p>
           <w:p>
             <w:pPr>
               <w:pStyle w:val="af2"/>
             </w:pPr>
-            <w:r>
-              <w:t>            for i in range(n - 1, -1, -1):</w:t>
-            </w:r>
           </w:p>
           <w:p>
             <w:pPr>
               <w:pStyle w:val="af2"/>
             </w:pPr>
             <w:r>
-              <w:t>                if abs(matrix[i, i]) &lt; 1e-18:</w:t>
+              <w:t>    @staticmethod</w:t>
             </w:r>
           </w:p>
           <w:p>
@@ -11136,7 +11835,15 @@
               <w:pStyle w:val="af2"/>
             </w:pPr>
             <w:r>
-              <w:t>                    x[i] = 0</w:t>
+              <w:t>    def poly2_</w:t>
+            </w:r>
+            <w:proofErr w:type="gramStart"/>
+            <w:r>
+              <w:t>approx(</w:t>
+            </w:r>
+            <w:proofErr w:type="gramEnd"/>
+            <w:r>
+              <w:t>x, y):</w:t>
             </w:r>
           </w:p>
           <w:p>
@@ -11144,7 +11851,47 @@
               <w:pStyle w:val="af2"/>
             </w:pPr>
             <w:r>
-              <w:t>                else:</w:t>
+              <w:t xml:space="preserve">        </w:t>
+            </w:r>
+            <w:proofErr w:type="spellStart"/>
+            <w:r>
+              <w:t>sx</w:t>
+            </w:r>
+            <w:proofErr w:type="spellEnd"/>
+            <w:r>
+              <w:t xml:space="preserve"> = [</w:t>
+            </w:r>
+            <w:proofErr w:type="spellStart"/>
+            <w:r>
+              <w:t>np.sum</w:t>
+            </w:r>
+            <w:proofErr w:type="spellEnd"/>
+            <w:r>
+              <w:t>(x**</w:t>
+            </w:r>
+            <w:proofErr w:type="spellStart"/>
+            <w:r>
+              <w:t>i</w:t>
+            </w:r>
+            <w:proofErr w:type="spellEnd"/>
+            <w:r>
+              <w:t xml:space="preserve">) for </w:t>
+            </w:r>
+            <w:proofErr w:type="spellStart"/>
+            <w:r>
+              <w:t>i</w:t>
+            </w:r>
+            <w:proofErr w:type="spellEnd"/>
+            <w:r>
+              <w:t xml:space="preserve"> in </w:t>
+            </w:r>
+            <w:proofErr w:type="gramStart"/>
+            <w:r>
+              <w:t>range(</w:t>
+            </w:r>
+            <w:proofErr w:type="gramEnd"/>
+            <w:r>
+              <w:t>5)]</w:t>
             </w:r>
           </w:p>
           <w:p>
@@ -11152,7 +11899,44 @@
               <w:pStyle w:val="af2"/>
             </w:pPr>
             <w:r>
-              <w:t>                    x[i] = (</w:t>
+              <w:t xml:space="preserve">        </w:t>
+            </w:r>
+            <w:proofErr w:type="spellStart"/>
+            <w:r>
+              <w:t>sxy</w:t>
+            </w:r>
+            <w:proofErr w:type="spellEnd"/>
+            <w:r>
+              <w:t xml:space="preserve"> = [</w:t>
+            </w:r>
+            <w:proofErr w:type="spellStart"/>
+            <w:proofErr w:type="gramStart"/>
+            <w:r>
+              <w:t>np.sum</w:t>
+            </w:r>
+            <w:proofErr w:type="spellEnd"/>
+            <w:r>
+              <w:t>(</w:t>
+            </w:r>
+            <w:proofErr w:type="gramEnd"/>
+            <w:r>
+              <w:t>y * (x**</w:t>
+            </w:r>
+            <w:proofErr w:type="spellStart"/>
+            <w:r>
+              <w:t>i</w:t>
+            </w:r>
+            <w:proofErr w:type="spellEnd"/>
+            <w:r>
+              <w:t xml:space="preserve">)) for </w:t>
+            </w:r>
+            <w:proofErr w:type="spellStart"/>
+            <w:r>
+              <w:t>i</w:t>
+            </w:r>
+            <w:proofErr w:type="spellEnd"/>
+            <w:r>
+              <w:t xml:space="preserve"> in range(3)]</w:t>
             </w:r>
           </w:p>
           <w:p>
@@ -11160,7 +11944,33 @@
               <w:pStyle w:val="af2"/>
             </w:pPr>
             <w:r>
-              <w:t>                        matrix[i, n] - np.dot(matrix[i, i + 1 : n], x[i + 1 : n])</w:t>
+              <w:t>        A = [[</w:t>
+            </w:r>
+            <w:proofErr w:type="spellStart"/>
+            <w:proofErr w:type="gramStart"/>
+            <w:r>
+              <w:t>sx</w:t>
+            </w:r>
+            <w:proofErr w:type="spellEnd"/>
+            <w:r>
+              <w:t>[</w:t>
+            </w:r>
+            <w:proofErr w:type="spellStart"/>
+            <w:proofErr w:type="gramEnd"/>
+            <w:r>
+              <w:t>i</w:t>
+            </w:r>
+            <w:proofErr w:type="spellEnd"/>
+            <w:r>
+              <w:t xml:space="preserve"> + j] for j in range(3)] for </w:t>
+            </w:r>
+            <w:proofErr w:type="spellStart"/>
+            <w:r>
+              <w:t>i</w:t>
+            </w:r>
+            <w:proofErr w:type="spellEnd"/>
+            <w:r>
+              <w:t xml:space="preserve"> in range(3)]</w:t>
             </w:r>
           </w:p>
           <w:p>
@@ -11168,7 +11978,31 @@
               <w:pStyle w:val="af2"/>
             </w:pPr>
             <w:r>
-              <w:t>                    ) / matrix[i, i]</w:t>
+              <w:t xml:space="preserve">        c = </w:t>
+            </w:r>
+            <w:proofErr w:type="spellStart"/>
+            <w:r>
+              <w:t>MathCore.solve_slaue_</w:t>
+            </w:r>
+            <w:proofErr w:type="gramStart"/>
+            <w:r>
+              <w:t>gauss</w:t>
+            </w:r>
+            <w:proofErr w:type="spellEnd"/>
+            <w:r>
+              <w:t>(</w:t>
+            </w:r>
+            <w:proofErr w:type="gramEnd"/>
+            <w:r>
+              <w:t xml:space="preserve">A, </w:t>
+            </w:r>
+            <w:proofErr w:type="spellStart"/>
+            <w:r>
+              <w:t>sxy</w:t>
+            </w:r>
+            <w:proofErr w:type="spellEnd"/>
+            <w:r>
+              <w:t>)  # [a0, a1, a2]</w:t>
             </w:r>
           </w:p>
           <w:p>
@@ -11176,7 +12010,7 @@
               <w:pStyle w:val="af2"/>
             </w:pPr>
             <w:r>
-              <w:t>            return x</w:t>
+              <w:t>        return (</w:t>
             </w:r>
           </w:p>
           <w:p>
@@ -11184,7 +12018,15 @@
               <w:pStyle w:val="af2"/>
             </w:pPr>
             <w:r>
-              <w:t>        except:</w:t>
+              <w:t xml:space="preserve">            (lambda t: </w:t>
+            </w:r>
+            <w:proofErr w:type="gramStart"/>
+            <w:r>
+              <w:t>c[</w:t>
+            </w:r>
+            <w:proofErr w:type="gramEnd"/>
+            <w:r>
+              <w:t>2] * t**2 + c[1] * t + c[0]),</w:t>
             </w:r>
           </w:p>
           <w:p>
@@ -11192,19 +12034,59 @@
               <w:pStyle w:val="af2"/>
             </w:pPr>
             <w:r>
-              <w:t>            return np.zeros(len(B))</w:t>
+              <w:t xml:space="preserve">            </w:t>
+            </w:r>
+            <w:proofErr w:type="spellStart"/>
+            <w:r>
+              <w:t>f"y</w:t>
+            </w:r>
+            <w:proofErr w:type="spellEnd"/>
+            <w:r>
+              <w:t xml:space="preserve"> = {c[2]:.4f}x² + {c[1]:.4f}x + {c[0]:.4f}",</w:t>
             </w:r>
           </w:p>
           <w:p>
             <w:pPr>
               <w:pStyle w:val="af2"/>
             </w:pPr>
+            <w:r>
+              <w:t xml:space="preserve">            </w:t>
+            </w:r>
+            <w:proofErr w:type="spellStart"/>
+            <w:r>
+              <w:t>c.</w:t>
+            </w:r>
+            <w:proofErr w:type="gramStart"/>
+            <w:r>
+              <w:t>tolist</w:t>
+            </w:r>
+            <w:proofErr w:type="spellEnd"/>
+            <w:r>
+              <w:t>(</w:t>
+            </w:r>
+            <w:proofErr w:type="gramEnd"/>
+            <w:r>
+              <w:t>),</w:t>
+            </w:r>
           </w:p>
           <w:p>
             <w:pPr>
               <w:pStyle w:val="af2"/>
             </w:pPr>
             <w:r>
+              <w:t>        )</w:t>
+            </w:r>
+          </w:p>
+          <w:p>
+            <w:pPr>
+              <w:pStyle w:val="af2"/>
+            </w:pPr>
+          </w:p>
+          <w:p>
+            <w:pPr>
+              <w:pStyle w:val="af2"/>
+            </w:pPr>
+            <w:r>
               <w:t>    @staticmethod</w:t>
             </w:r>
           </w:p>
@@ -11213,7 +12095,15 @@
               <w:pStyle w:val="af2"/>
             </w:pPr>
             <w:r>
-              <w:t>    def calculate_metrics(x, y, f):</w:t>
+              <w:t>    def poly3_</w:t>
+            </w:r>
+            <w:proofErr w:type="gramStart"/>
+            <w:r>
+              <w:t>approx(</w:t>
+            </w:r>
+            <w:proofErr w:type="gramEnd"/>
+            <w:r>
+              <w:t>x, y):</w:t>
             </w:r>
           </w:p>
           <w:p>
@@ -11221,7 +12111,47 @@
               <w:pStyle w:val="af2"/>
             </w:pPr>
             <w:r>
-              <w:t>        y_pred = np.array([f(val) for val in x])</w:t>
+              <w:t xml:space="preserve">        </w:t>
+            </w:r>
+            <w:proofErr w:type="spellStart"/>
+            <w:r>
+              <w:t>sx</w:t>
+            </w:r>
+            <w:proofErr w:type="spellEnd"/>
+            <w:r>
+              <w:t xml:space="preserve"> = [</w:t>
+            </w:r>
+            <w:proofErr w:type="spellStart"/>
+            <w:r>
+              <w:t>np.sum</w:t>
+            </w:r>
+            <w:proofErr w:type="spellEnd"/>
+            <w:r>
+              <w:t>(x**</w:t>
+            </w:r>
+            <w:proofErr w:type="spellStart"/>
+            <w:r>
+              <w:t>i</w:t>
+            </w:r>
+            <w:proofErr w:type="spellEnd"/>
+            <w:r>
+              <w:t xml:space="preserve">) for </w:t>
+            </w:r>
+            <w:proofErr w:type="spellStart"/>
+            <w:r>
+              <w:t>i</w:t>
+            </w:r>
+            <w:proofErr w:type="spellEnd"/>
+            <w:r>
+              <w:t xml:space="preserve"> in </w:t>
+            </w:r>
+            <w:proofErr w:type="gramStart"/>
+            <w:r>
+              <w:t>range(</w:t>
+            </w:r>
+            <w:proofErr w:type="gramEnd"/>
+            <w:r>
+              <w:t>7)]</w:t>
             </w:r>
           </w:p>
           <w:p>
@@ -11229,7 +12159,44 @@
               <w:pStyle w:val="af2"/>
             </w:pPr>
             <w:r>
-              <w:t>        eps = y - y_pred</w:t>
+              <w:t xml:space="preserve">        </w:t>
+            </w:r>
+            <w:proofErr w:type="spellStart"/>
+            <w:r>
+              <w:t>sxy</w:t>
+            </w:r>
+            <w:proofErr w:type="spellEnd"/>
+            <w:r>
+              <w:t xml:space="preserve"> = [</w:t>
+            </w:r>
+            <w:proofErr w:type="spellStart"/>
+            <w:proofErr w:type="gramStart"/>
+            <w:r>
+              <w:t>np.sum</w:t>
+            </w:r>
+            <w:proofErr w:type="spellEnd"/>
+            <w:r>
+              <w:t>(</w:t>
+            </w:r>
+            <w:proofErr w:type="gramEnd"/>
+            <w:r>
+              <w:t>y * (x**</w:t>
+            </w:r>
+            <w:proofErr w:type="spellStart"/>
+            <w:r>
+              <w:t>i</w:t>
+            </w:r>
+            <w:proofErr w:type="spellEnd"/>
+            <w:r>
+              <w:t xml:space="preserve">)) for </w:t>
+            </w:r>
+            <w:proofErr w:type="spellStart"/>
+            <w:r>
+              <w:t>i</w:t>
+            </w:r>
+            <w:proofErr w:type="spellEnd"/>
+            <w:r>
+              <w:t xml:space="preserve"> in range(4)]</w:t>
             </w:r>
           </w:p>
           <w:p>
@@ -11237,7 +12204,33 @@
               <w:pStyle w:val="af2"/>
             </w:pPr>
             <w:r>
-              <w:t>        s = np.sum(eps**2)</w:t>
+              <w:t>        A = [[</w:t>
+            </w:r>
+            <w:proofErr w:type="spellStart"/>
+            <w:proofErr w:type="gramStart"/>
+            <w:r>
+              <w:t>sx</w:t>
+            </w:r>
+            <w:proofErr w:type="spellEnd"/>
+            <w:r>
+              <w:t>[</w:t>
+            </w:r>
+            <w:proofErr w:type="spellStart"/>
+            <w:proofErr w:type="gramEnd"/>
+            <w:r>
+              <w:t>i</w:t>
+            </w:r>
+            <w:proofErr w:type="spellEnd"/>
+            <w:r>
+              <w:t xml:space="preserve"> + j] for j in range(4)] for </w:t>
+            </w:r>
+            <w:proofErr w:type="spellStart"/>
+            <w:r>
+              <w:t>i</w:t>
+            </w:r>
+            <w:proofErr w:type="spellEnd"/>
+            <w:r>
+              <w:t xml:space="preserve"> in range(4)]</w:t>
             </w:r>
           </w:p>
           <w:p>
@@ -11245,7 +12238,31 @@
               <w:pStyle w:val="af2"/>
             </w:pPr>
             <w:r>
-              <w:t>        rms = np.sqrt(s / len(x))</w:t>
+              <w:t xml:space="preserve">        c = </w:t>
+            </w:r>
+            <w:proofErr w:type="spellStart"/>
+            <w:r>
+              <w:t>MathCore.solve_slaue_</w:t>
+            </w:r>
+            <w:proofErr w:type="gramStart"/>
+            <w:r>
+              <w:t>gauss</w:t>
+            </w:r>
+            <w:proofErr w:type="spellEnd"/>
+            <w:r>
+              <w:t>(</w:t>
+            </w:r>
+            <w:proofErr w:type="gramEnd"/>
+            <w:r>
+              <w:t xml:space="preserve">A, </w:t>
+            </w:r>
+            <w:proofErr w:type="spellStart"/>
+            <w:r>
+              <w:t>sxy</w:t>
+            </w:r>
+            <w:proofErr w:type="spellEnd"/>
+            <w:r>
+              <w:t>)</w:t>
             </w:r>
           </w:p>
           <w:p>
@@ -11253,22 +12270,7 @@
               <w:pStyle w:val="af2"/>
             </w:pPr>
             <w:r>
-              <w:t xml:space="preserve">        r2 = 1 - (s / np.sum((y - np.mean(y)) ** 2)) # </w:t>
-            </w:r>
-            <w:r>
-              <w:rPr>
-                <w:lang w:val="ru-RU"/>
-              </w:rPr>
-              <w:t>Коэффициент</w:t>
-            </w:r>
-            <w:r>
-              <w:t xml:space="preserve"> </w:t>
-            </w:r>
-            <w:r>
-              <w:rPr>
-                <w:lang w:val="ru-RU"/>
-              </w:rPr>
-              <w:t>детерминации</w:t>
+              <w:t>        return (</w:t>
             </w:r>
           </w:p>
           <w:p>
@@ -11276,7 +12278,15 @@
               <w:pStyle w:val="af2"/>
             </w:pPr>
             <w:r>
-              <w:t>        return {</w:t>
+              <w:t xml:space="preserve">            (lambda t: </w:t>
+            </w:r>
+            <w:proofErr w:type="gramStart"/>
+            <w:r>
+              <w:t>c[</w:t>
+            </w:r>
+            <w:proofErr w:type="gramEnd"/>
+            <w:r>
+              <w:t>3] * t**3 + c[2] * t**2 + c[1] * t + c[0]),</w:t>
             </w:r>
           </w:p>
           <w:p>
@@ -11284,7 +12294,15 @@
               <w:pStyle w:val="af2"/>
             </w:pPr>
             <w:r>
-              <w:t>            "S": float(s),</w:t>
+              <w:t xml:space="preserve">            </w:t>
+            </w:r>
+            <w:proofErr w:type="spellStart"/>
+            <w:r>
+              <w:t>f"y</w:t>
+            </w:r>
+            <w:proofErr w:type="spellEnd"/>
+            <w:r>
+              <w:t xml:space="preserve"> = {c[3]:.4f}x³ + {c[2]:.4f}x² + {c[1]:.4f}x + {c[0]:.4f}",</w:t>
             </w:r>
           </w:p>
           <w:p>
@@ -11292,7 +12310,23 @@
               <w:pStyle w:val="af2"/>
             </w:pPr>
             <w:r>
-              <w:t>            "RMS": float(rms),</w:t>
+              <w:t xml:space="preserve">            </w:t>
+            </w:r>
+            <w:proofErr w:type="spellStart"/>
+            <w:r>
+              <w:t>c.</w:t>
+            </w:r>
+            <w:proofErr w:type="gramStart"/>
+            <w:r>
+              <w:t>tolist</w:t>
+            </w:r>
+            <w:proofErr w:type="spellEnd"/>
+            <w:r>
+              <w:t>(</w:t>
+            </w:r>
+            <w:proofErr w:type="gramEnd"/>
+            <w:r>
+              <w:t>),</w:t>
             </w:r>
           </w:p>
           <w:p>
@@ -11300,35 +12334,194 @@
               <w:pStyle w:val="af2"/>
             </w:pPr>
             <w:r>
-              <w:t>            "R2": float(r2),</w:t>
+              <w:t>        )</w:t>
             </w:r>
           </w:p>
           <w:p>
             <w:pPr>
               <w:pStyle w:val="af2"/>
             </w:pPr>
-            <w:r>
-              <w:t>            "y_pred": y_pred.tolist(),</w:t>
-            </w:r>
           </w:p>
           <w:p>
             <w:pPr>
               <w:pStyle w:val="af2"/>
             </w:pPr>
             <w:r>
-              <w:t>        }</w:t>
+              <w:t>    @staticmethod</w:t>
             </w:r>
           </w:p>
           <w:p>
             <w:pPr>
               <w:pStyle w:val="af2"/>
             </w:pPr>
+            <w:r>
+              <w:t xml:space="preserve">    def </w:t>
+            </w:r>
+            <w:proofErr w:type="spellStart"/>
+            <w:r>
+              <w:t>exp_</w:t>
+            </w:r>
+            <w:proofErr w:type="gramStart"/>
+            <w:r>
+              <w:t>approx</w:t>
+            </w:r>
+            <w:proofErr w:type="spellEnd"/>
+            <w:r>
+              <w:t>(</w:t>
+            </w:r>
+            <w:proofErr w:type="gramEnd"/>
+            <w:r>
+              <w:t>x, y):</w:t>
+            </w:r>
           </w:p>
           <w:p>
             <w:pPr>
               <w:pStyle w:val="af2"/>
             </w:pPr>
             <w:r>
+              <w:t xml:space="preserve">        if </w:t>
+            </w:r>
+            <w:proofErr w:type="spellStart"/>
+            <w:proofErr w:type="gramStart"/>
+            <w:r>
+              <w:t>np.any</w:t>
+            </w:r>
+            <w:proofErr w:type="spellEnd"/>
+            <w:r>
+              <w:t>(</w:t>
+            </w:r>
+            <w:proofErr w:type="gramEnd"/>
+            <w:r>
+              <w:t>y &lt;= 0):</w:t>
+            </w:r>
+          </w:p>
+          <w:p>
+            <w:pPr>
+              <w:pStyle w:val="af2"/>
+            </w:pPr>
+            <w:r>
+              <w:t>            return None, None, None</w:t>
+            </w:r>
+          </w:p>
+          <w:p>
+            <w:pPr>
+              <w:pStyle w:val="af2"/>
+            </w:pPr>
+            <w:r>
+              <w:t xml:space="preserve">        </w:t>
+            </w:r>
+            <w:proofErr w:type="spellStart"/>
+            <w:r>
+              <w:t>f_lin</w:t>
+            </w:r>
+            <w:proofErr w:type="spellEnd"/>
+            <w:r>
+              <w:t xml:space="preserve">, _, res = </w:t>
+            </w:r>
+            <w:proofErr w:type="spellStart"/>
+            <w:r>
+              <w:t>MathCore.linear_</w:t>
+            </w:r>
+            <w:proofErr w:type="gramStart"/>
+            <w:r>
+              <w:t>approx</w:t>
+            </w:r>
+            <w:proofErr w:type="spellEnd"/>
+            <w:r>
+              <w:t>(</w:t>
+            </w:r>
+            <w:proofErr w:type="gramEnd"/>
+            <w:r>
+              <w:t>x, np.log(y))</w:t>
+            </w:r>
+          </w:p>
+          <w:p>
+            <w:pPr>
+              <w:pStyle w:val="af2"/>
+            </w:pPr>
+            <w:r>
+              <w:t xml:space="preserve">        a, b = </w:t>
+            </w:r>
+            <w:proofErr w:type="spellStart"/>
+            <w:r>
+              <w:t>np.exp</w:t>
+            </w:r>
+            <w:proofErr w:type="spellEnd"/>
+            <w:r>
+              <w:t>(res["b"]), res["a"]</w:t>
+            </w:r>
+          </w:p>
+          <w:p>
+            <w:pPr>
+              <w:pStyle w:val="af2"/>
+            </w:pPr>
+            <w:r>
+              <w:t>        return (</w:t>
+            </w:r>
+          </w:p>
+          <w:p>
+            <w:pPr>
+              <w:pStyle w:val="af2"/>
+            </w:pPr>
+            <w:r>
+              <w:t xml:space="preserve">            (lambda t: a * </w:t>
+            </w:r>
+            <w:proofErr w:type="spellStart"/>
+            <w:proofErr w:type="gramStart"/>
+            <w:r>
+              <w:t>np.exp</w:t>
+            </w:r>
+            <w:proofErr w:type="spellEnd"/>
+            <w:r>
+              <w:t>(</w:t>
+            </w:r>
+            <w:proofErr w:type="gramEnd"/>
+            <w:r>
+              <w:t>b * t)),</w:t>
+            </w:r>
+          </w:p>
+          <w:p>
+            <w:pPr>
+              <w:pStyle w:val="af2"/>
+            </w:pPr>
+            <w:r>
+              <w:t xml:space="preserve">            </w:t>
+            </w:r>
+            <w:proofErr w:type="spellStart"/>
+            <w:r>
+              <w:t>f"y</w:t>
+            </w:r>
+            <w:proofErr w:type="spellEnd"/>
+            <w:r>
+              <w:t xml:space="preserve"> = {a:.4f} * e^({b:.4f}x)",</w:t>
+            </w:r>
+          </w:p>
+          <w:p>
+            <w:pPr>
+              <w:pStyle w:val="af2"/>
+            </w:pPr>
+            <w:r>
+              <w:t>            {"a": a, "b": b},</w:t>
+            </w:r>
+          </w:p>
+          <w:p>
+            <w:pPr>
+              <w:pStyle w:val="af2"/>
+            </w:pPr>
+            <w:r>
+              <w:t>        )</w:t>
+            </w:r>
+          </w:p>
+          <w:p>
+            <w:pPr>
+              <w:pStyle w:val="af2"/>
+            </w:pPr>
+          </w:p>
+          <w:p>
+            <w:pPr>
+              <w:pStyle w:val="af2"/>
+            </w:pPr>
+            <w:r>
               <w:t>    @staticmethod</w:t>
             </w:r>
           </w:p>
@@ -11337,7 +12530,23 @@
               <w:pStyle w:val="af2"/>
             </w:pPr>
             <w:r>
-              <w:t>    def linear_approx(x, y):</w:t>
+              <w:t xml:space="preserve">    def </w:t>
+            </w:r>
+            <w:proofErr w:type="spellStart"/>
+            <w:r>
+              <w:t>log_</w:t>
+            </w:r>
+            <w:proofErr w:type="gramStart"/>
+            <w:r>
+              <w:t>approx</w:t>
+            </w:r>
+            <w:proofErr w:type="spellEnd"/>
+            <w:r>
+              <w:t>(</w:t>
+            </w:r>
+            <w:proofErr w:type="gramEnd"/>
+            <w:r>
+              <w:t>x, y):</w:t>
             </w:r>
           </w:p>
           <w:p>
@@ -11345,7 +12554,20 @@
               <w:pStyle w:val="af2"/>
             </w:pPr>
             <w:r>
-              <w:t>        n = len(x)</w:t>
+              <w:t xml:space="preserve">        if </w:t>
+            </w:r>
+            <w:proofErr w:type="spellStart"/>
+            <w:proofErr w:type="gramStart"/>
+            <w:r>
+              <w:t>np.any</w:t>
+            </w:r>
+            <w:proofErr w:type="spellEnd"/>
+            <w:r>
+              <w:t>(</w:t>
+            </w:r>
+            <w:proofErr w:type="gramEnd"/>
+            <w:r>
+              <w:t>x &lt;= 0):</w:t>
             </w:r>
           </w:p>
           <w:p>
@@ -11353,7 +12575,7 @@
               <w:pStyle w:val="af2"/>
             </w:pPr>
             <w:r>
-              <w:t>        sx, sy, sx2, sxy = np.sum(x), np.sum(y), np.sum(x**2), np.sum(x * y)</w:t>
+              <w:t>            return None, None, None</w:t>
             </w:r>
           </w:p>
           <w:p>
@@ -11361,7 +12583,23 @@
               <w:pStyle w:val="af2"/>
             </w:pPr>
             <w:r>
-              <w:t>        A = [[sx2, sx], [sx, n]]</w:t>
+              <w:t xml:space="preserve">        </w:t>
+            </w:r>
+            <w:proofErr w:type="spellStart"/>
+            <w:r>
+              <w:t>f_lin</w:t>
+            </w:r>
+            <w:proofErr w:type="spellEnd"/>
+            <w:r>
+              <w:t xml:space="preserve">, _, res = </w:t>
+            </w:r>
+            <w:proofErr w:type="spellStart"/>
+            <w:r>
+              <w:t>MathCore.linear_approx</w:t>
+            </w:r>
+            <w:proofErr w:type="spellEnd"/>
+            <w:r>
+              <w:t>(np.log(x), y)</w:t>
             </w:r>
           </w:p>
           <w:p>
@@ -11369,7 +12607,7 @@
               <w:pStyle w:val="af2"/>
             </w:pPr>
             <w:r>
-              <w:t>        B = [sxy, sy]</w:t>
+              <w:t>        return (</w:t>
             </w:r>
           </w:p>
           <w:p>
@@ -11377,7 +12615,7 @@
               <w:pStyle w:val="af2"/>
             </w:pPr>
             <w:r>
-              <w:t>        coeffs = MathCore.solve_slaue_gauss(A, B)  # [a, b]</w:t>
+              <w:t>            (lambda t: res["a"] * np.log(t) + res["b"]),</w:t>
             </w:r>
           </w:p>
           <w:p>
@@ -11385,36 +12623,52 @@
               <w:pStyle w:val="af2"/>
             </w:pPr>
             <w:r>
-              <w:t>        a, b = coeffs[0], coeffs[1]</w:t>
+              <w:t xml:space="preserve">            </w:t>
+            </w:r>
+            <w:proofErr w:type="spellStart"/>
+            <w:r>
+              <w:t>f"y</w:t>
+            </w:r>
+            <w:proofErr w:type="spellEnd"/>
+            <w:r>
+              <w:t xml:space="preserve"> = {res['a']:.4</w:t>
+            </w:r>
+            <w:proofErr w:type="gramStart"/>
+            <w:r>
+              <w:t>f}ln</w:t>
+            </w:r>
+            <w:proofErr w:type="gramEnd"/>
+            <w:r>
+              <w:t>(x) + {res['b']:.4f}",</w:t>
             </w:r>
           </w:p>
           <w:p>
             <w:pPr>
               <w:pStyle w:val="af2"/>
             </w:pPr>
+            <w:r>
+              <w:t>            res,</w:t>
+            </w:r>
           </w:p>
           <w:p>
             <w:pPr>
               <w:pStyle w:val="af2"/>
             </w:pPr>
             <w:r>
-              <w:t>        xm, ym = np.mean(x), np.mean(y)</w:t>
+              <w:t>        )</w:t>
             </w:r>
           </w:p>
           <w:p>
             <w:pPr>
               <w:pStyle w:val="af2"/>
             </w:pPr>
-            <w:r>
-              <w:t>        p = np.sum((x - xm) * (y - ym)) / (</w:t>
-            </w:r>
           </w:p>
           <w:p>
             <w:pPr>
               <w:pStyle w:val="af2"/>
             </w:pPr>
             <w:r>
-              <w:t>            np.sqrt(np.sum((x - xm) ** 2) * np.sum((y - ym) ** 2)) or 1</w:t>
+              <w:t>    @staticmethod</w:t>
             </w:r>
           </w:p>
           <w:p>
@@ -11422,7 +12676,24 @@
               <w:pStyle w:val="af2"/>
             </w:pPr>
             <w:r>
-              <w:t>        )</w:t>
+              <w:lastRenderedPageBreak/>
+              <w:t xml:space="preserve">    def </w:t>
+            </w:r>
+            <w:proofErr w:type="spellStart"/>
+            <w:r>
+              <w:t>pow_</w:t>
+            </w:r>
+            <w:proofErr w:type="gramStart"/>
+            <w:r>
+              <w:t>approx</w:t>
+            </w:r>
+            <w:proofErr w:type="spellEnd"/>
+            <w:r>
+              <w:t>(</w:t>
+            </w:r>
+            <w:proofErr w:type="gramEnd"/>
+            <w:r>
+              <w:t>x, y):</w:t>
             </w:r>
           </w:p>
           <w:p>
@@ -11430,7 +12701,28 @@
               <w:pStyle w:val="af2"/>
             </w:pPr>
             <w:r>
-              <w:t>        return (</w:t>
+              <w:t xml:space="preserve">        if </w:t>
+            </w:r>
+            <w:proofErr w:type="spellStart"/>
+            <w:proofErr w:type="gramStart"/>
+            <w:r>
+              <w:t>np.any</w:t>
+            </w:r>
+            <w:proofErr w:type="spellEnd"/>
+            <w:r>
+              <w:t>(</w:t>
+            </w:r>
+            <w:proofErr w:type="gramEnd"/>
+            <w:r>
+              <w:t xml:space="preserve">x &lt;= 0) or </w:t>
+            </w:r>
+            <w:proofErr w:type="spellStart"/>
+            <w:r>
+              <w:t>np.any</w:t>
+            </w:r>
+            <w:proofErr w:type="spellEnd"/>
+            <w:r>
+              <w:t>(y &lt;= 0):</w:t>
             </w:r>
           </w:p>
           <w:p>
@@ -11438,7 +12730,7 @@
               <w:pStyle w:val="af2"/>
             </w:pPr>
             <w:r>
-              <w:t>            (lambda t: a * t + b),</w:t>
+              <w:t>            return None, None, None</w:t>
             </w:r>
           </w:p>
           <w:p>
@@ -11446,7 +12738,23 @@
               <w:pStyle w:val="af2"/>
             </w:pPr>
             <w:r>
-              <w:t>            f"y = {a:.4f}x + {b:.4f}",</w:t>
+              <w:t xml:space="preserve">        </w:t>
+            </w:r>
+            <w:proofErr w:type="spellStart"/>
+            <w:r>
+              <w:t>f_lin</w:t>
+            </w:r>
+            <w:proofErr w:type="spellEnd"/>
+            <w:r>
+              <w:t xml:space="preserve">, _, res = </w:t>
+            </w:r>
+            <w:proofErr w:type="spellStart"/>
+            <w:r>
+              <w:t>MathCore.linear_approx</w:t>
+            </w:r>
+            <w:proofErr w:type="spellEnd"/>
+            <w:r>
+              <w:t>(np.log(x), np.log(y))</w:t>
             </w:r>
           </w:p>
           <w:p>
@@ -11454,7 +12762,15 @@
               <w:pStyle w:val="af2"/>
             </w:pPr>
             <w:r>
-              <w:t>            {"a": a, "b": b, "P": p},</w:t>
+              <w:t xml:space="preserve">        a, b = </w:t>
+            </w:r>
+            <w:proofErr w:type="spellStart"/>
+            <w:r>
+              <w:t>np.exp</w:t>
+            </w:r>
+            <w:proofErr w:type="spellEnd"/>
+            <w:r>
+              <w:t>(res["b"]), res["a"]</w:t>
             </w:r>
           </w:p>
           <w:p>
@@ -11462,433 +12778,15 @@
               <w:pStyle w:val="af2"/>
             </w:pPr>
             <w:r>
-              <w:t>        )</w:t>
-            </w:r>
-          </w:p>
-          <w:p>
-            <w:pPr>
-              <w:pStyle w:val="af2"/>
-            </w:pPr>
-          </w:p>
-          <w:p>
-            <w:pPr>
-              <w:pStyle w:val="af2"/>
-            </w:pPr>
-            <w:r>
-              <w:t>    @staticmethod</w:t>
-            </w:r>
-          </w:p>
-          <w:p>
-            <w:pPr>
-              <w:pStyle w:val="af2"/>
-            </w:pPr>
-            <w:r>
-              <w:t>    def poly2_approx(x, y):</w:t>
-            </w:r>
-          </w:p>
-          <w:p>
-            <w:pPr>
-              <w:pStyle w:val="af2"/>
-            </w:pPr>
-            <w:r>
-              <w:t>        sx = [np.sum(x**i) for i in range(5)]</w:t>
-            </w:r>
-          </w:p>
-          <w:p>
-            <w:pPr>
-              <w:pStyle w:val="af2"/>
-            </w:pPr>
-            <w:r>
-              <w:t>        sxy = [np.sum(y * (x**i)) for i in range(3)]</w:t>
-            </w:r>
-          </w:p>
-          <w:p>
-            <w:pPr>
-              <w:pStyle w:val="af2"/>
-            </w:pPr>
-            <w:r>
-              <w:t>        A = [[sx[i + j] for j in range(3)] for i in range(3)]</w:t>
-            </w:r>
-          </w:p>
-          <w:p>
-            <w:pPr>
-              <w:pStyle w:val="af2"/>
-            </w:pPr>
-            <w:r>
-              <w:t>        c = MathCore.solve_slaue_gauss(A, sxy)  # [a0, a1, a2]</w:t>
-            </w:r>
-          </w:p>
-          <w:p>
-            <w:pPr>
-              <w:pStyle w:val="af2"/>
-            </w:pPr>
-            <w:r>
-              <w:t>        return (</w:t>
-            </w:r>
-          </w:p>
-          <w:p>
-            <w:pPr>
-              <w:pStyle w:val="af2"/>
-            </w:pPr>
-            <w:r>
-              <w:t>            (lambda t: c[2] * t**2 + c[1] * t + c[0]),</w:t>
-            </w:r>
-          </w:p>
-          <w:p>
-            <w:pPr>
-              <w:pStyle w:val="af2"/>
-            </w:pPr>
-            <w:r>
-              <w:t>            f"y = {c[2]:.4f}x² + {c[1]:.4f}x + {c[0]:.4f}",</w:t>
-            </w:r>
-          </w:p>
-          <w:p>
-            <w:pPr>
-              <w:pStyle w:val="af2"/>
-            </w:pPr>
-            <w:r>
-              <w:t>            c.tolist(),</w:t>
-            </w:r>
-          </w:p>
-          <w:p>
-            <w:pPr>
-              <w:pStyle w:val="af2"/>
-            </w:pPr>
-            <w:r>
-              <w:t>        )</w:t>
-            </w:r>
-          </w:p>
-          <w:p>
-            <w:pPr>
-              <w:pStyle w:val="af2"/>
-            </w:pPr>
-          </w:p>
-          <w:p>
-            <w:pPr>
-              <w:pStyle w:val="af2"/>
-            </w:pPr>
-            <w:r>
-              <w:t>    @staticmethod</w:t>
-            </w:r>
-          </w:p>
-          <w:p>
-            <w:pPr>
-              <w:pStyle w:val="af2"/>
-            </w:pPr>
-            <w:r>
-              <w:t>    def poly3_approx(x, y):</w:t>
-            </w:r>
-          </w:p>
-          <w:p>
-            <w:pPr>
-              <w:pStyle w:val="af2"/>
-            </w:pPr>
-            <w:r>
-              <w:t>        sx = [np.sum(x**i) for i in range(7)]</w:t>
-            </w:r>
-          </w:p>
-          <w:p>
-            <w:pPr>
-              <w:pStyle w:val="af2"/>
-            </w:pPr>
-            <w:r>
-              <w:t>        sxy = [np.sum(y * (x**i)) for i in range(4)]</w:t>
-            </w:r>
-          </w:p>
-          <w:p>
-            <w:pPr>
-              <w:pStyle w:val="af2"/>
-            </w:pPr>
-            <w:r>
-              <w:t>        A = [[sx[i + j] for j in range(4)] for i in range(4)]</w:t>
-            </w:r>
-          </w:p>
-          <w:p>
-            <w:pPr>
-              <w:pStyle w:val="af2"/>
-            </w:pPr>
-            <w:r>
-              <w:t>        c = MathCore.solve_slaue_gauss(A, sxy)</w:t>
-            </w:r>
-          </w:p>
-          <w:p>
-            <w:pPr>
-              <w:pStyle w:val="af2"/>
-            </w:pPr>
-            <w:r>
-              <w:t>        return (</w:t>
-            </w:r>
-          </w:p>
-          <w:p>
-            <w:pPr>
-              <w:pStyle w:val="af2"/>
-            </w:pPr>
-            <w:r>
-              <w:lastRenderedPageBreak/>
-              <w:t>            (lambda t: c[3] * t**3 + c[2] * t**2 + c[1] * t + c[0]),</w:t>
-            </w:r>
-          </w:p>
-          <w:p>
-            <w:pPr>
-              <w:pStyle w:val="af2"/>
-            </w:pPr>
-            <w:r>
-              <w:t>            f"y = {c[3]:.4f}x³ + {c[2]:.4f}x² + {c[1]:.4f}x + {c[0]:.4f}",</w:t>
-            </w:r>
-          </w:p>
-          <w:p>
-            <w:pPr>
-              <w:pStyle w:val="af2"/>
-            </w:pPr>
-            <w:r>
-              <w:t>            c.tolist(),</w:t>
-            </w:r>
-          </w:p>
-          <w:p>
-            <w:pPr>
-              <w:pStyle w:val="af2"/>
-            </w:pPr>
-            <w:r>
-              <w:t>        )</w:t>
-            </w:r>
-          </w:p>
-          <w:p>
-            <w:pPr>
-              <w:pStyle w:val="af2"/>
-            </w:pPr>
-          </w:p>
-          <w:p>
-            <w:pPr>
-              <w:pStyle w:val="af2"/>
-            </w:pPr>
-            <w:r>
-              <w:t>    @staticmethod</w:t>
-            </w:r>
-          </w:p>
-          <w:p>
-            <w:pPr>
-              <w:pStyle w:val="af2"/>
-            </w:pPr>
-            <w:r>
-              <w:t>    def exp_approx(x, y):</w:t>
-            </w:r>
-          </w:p>
-          <w:p>
-            <w:pPr>
-              <w:pStyle w:val="af2"/>
-            </w:pPr>
-            <w:r>
-              <w:t>        if np.any(y &lt;= 0):</w:t>
-            </w:r>
-          </w:p>
-          <w:p>
-            <w:pPr>
-              <w:pStyle w:val="af2"/>
-            </w:pPr>
-            <w:r>
-              <w:t>            return None, None, None</w:t>
-            </w:r>
-          </w:p>
-          <w:p>
-            <w:pPr>
-              <w:pStyle w:val="af2"/>
-            </w:pPr>
-            <w:r>
-              <w:t>        f_lin, _, res = MathCore.linear_approx(x, np.log(y))</w:t>
-            </w:r>
-          </w:p>
-          <w:p>
-            <w:pPr>
-              <w:pStyle w:val="af2"/>
-            </w:pPr>
-            <w:r>
-              <w:t>        a, b = np.exp(res["b"]), res["a"]</w:t>
-            </w:r>
-          </w:p>
-          <w:p>
-            <w:pPr>
-              <w:pStyle w:val="af2"/>
-            </w:pPr>
-            <w:r>
-              <w:t>        return (</w:t>
-            </w:r>
-          </w:p>
-          <w:p>
-            <w:pPr>
-              <w:pStyle w:val="af2"/>
-            </w:pPr>
-            <w:r>
-              <w:t>            (lambda t: a * np.exp(b * t)),</w:t>
-            </w:r>
-          </w:p>
-          <w:p>
-            <w:pPr>
-              <w:pStyle w:val="af2"/>
-            </w:pPr>
-            <w:r>
-              <w:t>            f"y = {a:.4f} * e^({b:.4f}x)",</w:t>
-            </w:r>
-          </w:p>
-          <w:p>
-            <w:pPr>
-              <w:pStyle w:val="af2"/>
-            </w:pPr>
-            <w:r>
-              <w:t>            {"a": a, "b": b},</w:t>
-            </w:r>
-          </w:p>
-          <w:p>
-            <w:pPr>
-              <w:pStyle w:val="af2"/>
-            </w:pPr>
-            <w:r>
-              <w:t>        )</w:t>
-            </w:r>
-          </w:p>
-          <w:p>
-            <w:pPr>
-              <w:pStyle w:val="af2"/>
-            </w:pPr>
-          </w:p>
-          <w:p>
-            <w:pPr>
-              <w:pStyle w:val="af2"/>
-            </w:pPr>
-            <w:r>
-              <w:t>    @staticmethod</w:t>
-            </w:r>
-          </w:p>
-          <w:p>
-            <w:pPr>
-              <w:pStyle w:val="af2"/>
-            </w:pPr>
-            <w:r>
-              <w:t>    def log_approx(x, y):</w:t>
-            </w:r>
-          </w:p>
-          <w:p>
-            <w:pPr>
-              <w:pStyle w:val="af2"/>
-            </w:pPr>
-            <w:r>
-              <w:t>        if np.any(x &lt;= 0):</w:t>
-            </w:r>
-          </w:p>
-          <w:p>
-            <w:pPr>
-              <w:pStyle w:val="af2"/>
-            </w:pPr>
-            <w:r>
-              <w:t>            return None, None, None</w:t>
-            </w:r>
-          </w:p>
-          <w:p>
-            <w:pPr>
-              <w:pStyle w:val="af2"/>
-            </w:pPr>
-            <w:r>
-              <w:t>        f_lin, _, res = MathCore.linear_approx(np.log(x), y)</w:t>
-            </w:r>
-          </w:p>
-          <w:p>
-            <w:pPr>
-              <w:pStyle w:val="af2"/>
-            </w:pPr>
-            <w:r>
-              <w:t>        return (</w:t>
-            </w:r>
-          </w:p>
-          <w:p>
-            <w:pPr>
-              <w:pStyle w:val="af2"/>
-            </w:pPr>
-            <w:r>
-              <w:t>            (lambda t: res["a"] * np.log(t) + res["b"]),</w:t>
-            </w:r>
-          </w:p>
-          <w:p>
-            <w:pPr>
-              <w:pStyle w:val="af2"/>
-            </w:pPr>
-            <w:r>
-              <w:t>            f"y = {res['a']:.4f}ln(x) + {res['b']:.4f}",</w:t>
-            </w:r>
-          </w:p>
-          <w:p>
-            <w:pPr>
-              <w:pStyle w:val="af2"/>
-            </w:pPr>
-            <w:r>
-              <w:t>            res,</w:t>
-            </w:r>
-          </w:p>
-          <w:p>
-            <w:pPr>
-              <w:pStyle w:val="af2"/>
-            </w:pPr>
-            <w:r>
-              <w:t>        )</w:t>
-            </w:r>
-          </w:p>
-          <w:p>
-            <w:pPr>
-              <w:pStyle w:val="af2"/>
-            </w:pPr>
-          </w:p>
-          <w:p>
-            <w:pPr>
-              <w:pStyle w:val="af2"/>
-            </w:pPr>
-            <w:r>
-              <w:t>    @staticmethod</w:t>
-            </w:r>
-          </w:p>
-          <w:p>
-            <w:pPr>
-              <w:pStyle w:val="af2"/>
-            </w:pPr>
-            <w:r>
-              <w:t>    def pow_approx(x, y):</w:t>
-            </w:r>
-          </w:p>
-          <w:p>
-            <w:pPr>
-              <w:pStyle w:val="af2"/>
-            </w:pPr>
-            <w:r>
-              <w:t>        if np.any(x &lt;= 0) or np.any(y &lt;= 0):</w:t>
-            </w:r>
-          </w:p>
-          <w:p>
-            <w:pPr>
-              <w:pStyle w:val="af2"/>
-            </w:pPr>
-            <w:r>
-              <w:t>            return None, None, None</w:t>
-            </w:r>
-          </w:p>
-          <w:p>
-            <w:pPr>
-              <w:pStyle w:val="af2"/>
-            </w:pPr>
-            <w:r>
-              <w:t>        f_lin, _, res = MathCore.linear_approx(np.log(x), np.log(y))</w:t>
-            </w:r>
-          </w:p>
-          <w:p>
-            <w:pPr>
-              <w:pStyle w:val="af2"/>
-            </w:pPr>
-            <w:r>
-              <w:t>        a, b = np.exp(res["b"]), res["a"]</w:t>
-            </w:r>
-          </w:p>
-          <w:p>
-            <w:pPr>
-              <w:pStyle w:val="af2"/>
-            </w:pPr>
-            <w:r>
-              <w:t>        return (lambda t: a * (t**b)), f"y = {a:.4f} * x^{b:.4f}", {"a": a, "b": b}</w:t>
+              <w:t xml:space="preserve">        return (lambda t: a * (t**b)), </w:t>
+            </w:r>
+            <w:proofErr w:type="spellStart"/>
+            <w:r>
+              <w:t>f"y</w:t>
+            </w:r>
+            <w:proofErr w:type="spellEnd"/>
+            <w:r>
+              <w:t xml:space="preserve"> = {a:.4f} * x^{b:.4f}", {"a": a, "b": b}</w:t>
             </w:r>
           </w:p>
           <w:p>
@@ -11929,7 +12827,7 @@
       </w:r>
     </w:p>
     <w:p>
-      <w:hyperlink r:id="rId13" w:history="1">
+      <w:hyperlink r:id="rId14" w:history="1">
         <w:r>
           <w:rPr>
             <w:rStyle w:val="aa"/>
@@ -11945,76 +12843,20 @@
     </w:p>
     <w:p/>
     <w:p/>
-    <w:p/>
     <w:p>
       <w:pPr>
-        <w:pStyle w:val="10"/>
-      </w:pPr>
-      <w:bookmarkStart w:id="20" w:name="_Toc227189153"/>
-      <w:r>
-        <w:lastRenderedPageBreak/>
-        <w:t>Результат работы</w:t>
-      </w:r>
-      <w:bookmarkEnd w:id="20"/>
+        <w:ind w:firstLine="0"/>
+      </w:pPr>
     </w:p>
     <w:p>
       <w:pPr>
-        <w:jc w:val="center"/>
-        <w:rPr>
-          <w:lang w:val="en-US"/>
-        </w:rPr>
-      </w:pPr>
-      <w:r>
-        <w:rPr>
-          <w:noProof/>
-          <w:lang w:val="en-US"/>
-        </w:rPr>
-        <w:drawing>
-          <wp:inline distT="0" distB="0" distL="0" distR="0" wp14:anchorId="74A8770B" wp14:editId="0B16A942">
-            <wp:extent cx="4795284" cy="3093814"/>
-            <wp:effectExtent l="0" t="0" r="5715" b="0"/>
-            <wp:docPr id="10" name="Рисунок 10"/>
-            <wp:cNvGraphicFramePr>
-              <a:graphicFrameLocks xmlns:a="http://schemas.openxmlformats.org/drawingml/2006/main" noChangeAspect="1"/>
-            </wp:cNvGraphicFramePr>
-            <a:graphic xmlns:a="http://schemas.openxmlformats.org/drawingml/2006/main">
-              <a:graphicData uri="http://schemas.openxmlformats.org/drawingml/2006/picture">
-                <pic:pic xmlns:pic="http://schemas.openxmlformats.org/drawingml/2006/picture">
-                  <pic:nvPicPr>
-                    <pic:cNvPr id="1" name=""/>
-                    <pic:cNvPicPr/>
-                  </pic:nvPicPr>
-                  <pic:blipFill>
-                    <a:blip r:embed="rId14"/>
-                    <a:stretch>
-                      <a:fillRect/>
-                    </a:stretch>
-                  </pic:blipFill>
-                  <pic:spPr>
-                    <a:xfrm>
-                      <a:off x="0" y="0"/>
-                      <a:ext cx="4805952" cy="3100697"/>
-                    </a:xfrm>
-                    <a:prstGeom prst="rect">
-                      <a:avLst/>
-                    </a:prstGeom>
-                  </pic:spPr>
-                </pic:pic>
-              </a:graphicData>
-            </a:graphic>
-          </wp:inline>
-        </w:drawing>
-      </w:r>
-    </w:p>
-    <w:p>
-      <w:pPr>
         <w:pStyle w:val="10"/>
       </w:pPr>
-      <w:bookmarkStart w:id="21" w:name="_Toc227189154"/>
+      <w:bookmarkStart w:id="15" w:name="_Toc229672652"/>
       <w:r>
         <w:t>Вывод</w:t>
       </w:r>
-      <w:bookmarkEnd w:id="21"/>
+      <w:bookmarkEnd w:id="15"/>
     </w:p>
     <w:p>
       <w:pPr>
@@ -14510,6 +15352,7 @@
   <w:style w:type="character" w:default="1" w:styleId="a1">
     <w:name w:val="Default Paragraph Font"/>
     <w:uiPriority w:val="1"/>
+    <w:semiHidden/>
     <w:unhideWhenUsed/>
   </w:style>
   <w:style w:type="table" w:default="1" w:styleId="a2">

</xml_diff>